<commit_message>
Initial publish to correct repo
</commit_message>
<xml_diff>
--- a/my github.docx
+++ b/my github.docx
@@ -257,25 +257,7 @@
           <w:sz w:val="24"/>
           <w:szCs w:val="24"/>
         </w:rPr>
-        <w:t>(</w:t>
-      </w:r>
-      <w:proofErr w:type="gramStart"/>
-      <w:r>
-        <w:rPr>
-          <w:rFonts w:ascii="Times New Roman" w:eastAsia="Times New Roman" w:hAnsi="Times New Roman" w:cs="Times New Roman"/>
-          <w:sz w:val="24"/>
-          <w:szCs w:val="24"/>
-        </w:rPr>
-        <w:t>replace</w:t>
-      </w:r>
-      <w:proofErr w:type="gramEnd"/>
-      <w:r>
-        <w:rPr>
-          <w:rFonts w:ascii="Times New Roman" w:eastAsia="Times New Roman" w:hAnsi="Times New Roman" w:cs="Times New Roman"/>
-          <w:sz w:val="24"/>
-          <w:szCs w:val="24"/>
-        </w:rPr>
-        <w:t xml:space="preserve"> </w:t>
+        <w:t xml:space="preserve">(replace </w:t>
       </w:r>
       <w:r>
         <w:rPr>
@@ -946,25 +928,7 @@
           <w:sz w:val="20"/>
           <w:szCs w:val="20"/>
         </w:rPr>
-        <w:t xml:space="preserve">  &lt;p&gt;PhD Candidate in Finance, [Your </w:t>
-      </w:r>
-      <w:proofErr w:type="gramStart"/>
-      <w:r>
-        <w:rPr>
-          <w:rFonts w:ascii="Courier New" w:eastAsia="Times New Roman" w:hAnsi="Courier New" w:cs="Courier New"/>
-          <w:sz w:val="20"/>
-          <w:szCs w:val="20"/>
-        </w:rPr>
-        <w:t>University]&lt;</w:t>
-      </w:r>
-      <w:proofErr w:type="gramEnd"/>
-      <w:r>
-        <w:rPr>
-          <w:rFonts w:ascii="Courier New" w:eastAsia="Times New Roman" w:hAnsi="Courier New" w:cs="Courier New"/>
-          <w:sz w:val="20"/>
-          <w:szCs w:val="20"/>
-        </w:rPr>
-        <w:t>/p&gt;</w:t>
+        <w:t xml:space="preserve">  &lt;p&gt;PhD Candidate in Finance, [Your University]&lt;/p&gt;</w:t>
       </w:r>
     </w:p>
     <w:p>
@@ -1965,23 +1929,13 @@
           <w:szCs w:val="20"/>
         </w:rPr>
       </w:pPr>
-      <w:proofErr w:type="gramStart"/>
       <w:r>
         <w:rPr>
           <w:rFonts w:ascii="Courier New" w:eastAsia="Times New Roman" w:hAnsi="Courier New" w:cs="Courier New"/>
           <w:sz w:val="20"/>
           <w:szCs w:val="20"/>
         </w:rPr>
-        <w:t>a:hover</w:t>
-      </w:r>
-      <w:proofErr w:type="gramEnd"/>
-      <w:r>
-        <w:rPr>
-          <w:rFonts w:ascii="Courier New" w:eastAsia="Times New Roman" w:hAnsi="Courier New" w:cs="Courier New"/>
-          <w:sz w:val="20"/>
-          <w:szCs w:val="20"/>
-        </w:rPr>
-        <w:t xml:space="preserve"> {</w:t>
+        <w:t>a:hover {</w:t>
       </w:r>
     </w:p>
     <w:p>
@@ -4428,62 +4382,31 @@
     <w:p/>
     <w:p/>
     <w:p/>
-    <w:p/>
     <w:p>
       <w:pPr>
         <w:pStyle w:val="NormalWeb"/>
       </w:pPr>
       <w:r>
-        <w:t xml:space="preserve">gotcha — let’s do everything </w:t>
+        <w:lastRenderedPageBreak/>
+        <w:t xml:space="preserve">In VS Code (local folder), update the </w:t>
       </w:r>
       <w:r>
         <w:rPr>
           <w:rStyle w:val="Strong"/>
         </w:rPr>
-        <w:t>inside VS Code</w:t>
-      </w:r>
-      <w:r>
-        <w:t xml:space="preserve"> (no cmd). I’ll walk you through: </w:t>
+        <w:t>remote</w:t>
+      </w:r>
+      <w:r>
+        <w:t xml:space="preserve"> to point to the </w:t>
       </w:r>
       <w:r>
         <w:rPr>
           <w:rStyle w:val="Strong"/>
         </w:rPr>
-        <w:t>sign in to GitHub → initialize the repo → link it to your GitHub repo → commit → push</w:t>
-      </w:r>
-      <w:r>
-        <w:t>.</w:t>
-      </w:r>
-    </w:p>
-    <w:p>
-      <w:pPr>
-        <w:pStyle w:val="Heading2"/>
-      </w:pPr>
-      <w:r>
-        <w:t>0) Quick check: Git installed?</w:t>
-      </w:r>
-    </w:p>
-    <w:p>
-      <w:pPr>
-        <w:pStyle w:val="NormalWeb"/>
-      </w:pPr>
-      <w:r>
-        <w:t>VS Code needs Git. If you see a prompt “Git not found,” install it from git-scm.com, then restart VS Code. If you don’t see that prompt, you’re good.</w:t>
-      </w:r>
-    </w:p>
-    <w:p>
-      <w:r>
-        <w:pict w14:anchorId="47965055">
-          <v:rect id="_x0000_i1056" style="width:0;height:1.5pt" o:hralign="center" o:hrstd="t" o:hr="t" fillcolor="#a0a0a0" stroked="f"/>
-        </w:pict>
-      </w:r>
-    </w:p>
-    <w:p>
-      <w:pPr>
-        <w:pStyle w:val="Heading2"/>
-      </w:pPr>
-      <w:r>
-        <w:t>1) Sign in to GitHub in VS Code</w:t>
+        <w:t>correct</w:t>
+      </w:r>
+      <w:r>
+        <w:t xml:space="preserve"> repo:</w:t>
       </w:r>
     </w:p>
     <w:p>
@@ -4491,11 +4414,26 @@
         <w:pStyle w:val="NormalWeb"/>
         <w:numPr>
           <w:ilvl w:val="0"/>
-          <w:numId w:val="13"/>
+          <w:numId w:val="27"/>
         </w:numPr>
       </w:pPr>
       <w:r>
-        <w:t>Open VS Code (your website folder is already open).</w:t>
+        <w:t xml:space="preserve">Press </w:t>
+      </w:r>
+      <w:r>
+        <w:rPr>
+          <w:rStyle w:val="Strong"/>
+        </w:rPr>
+        <w:t>Ctrl+Shift+P</w:t>
+      </w:r>
+      <w:r>
+        <w:t xml:space="preserve"> → </w:t>
+      </w:r>
+      <w:r>
+        <w:rPr>
+          <w:rStyle w:val="Strong"/>
+        </w:rPr>
+        <w:t>Git: Add Remote</w:t>
       </w:r>
     </w:p>
     <w:p>
@@ -4503,59 +4441,26 @@
         <w:pStyle w:val="NormalWeb"/>
         <w:numPr>
           <w:ilvl w:val="0"/>
-          <w:numId w:val="13"/>
+          <w:numId w:val="27"/>
         </w:numPr>
       </w:pPr>
       <w:r>
-        <w:t xml:space="preserve">Click the </w:t>
+        <w:t xml:space="preserve">Or if </w:t>
+      </w:r>
+      <w:r>
+        <w:rPr>
+          <w:rStyle w:val="HTMLCode"/>
+        </w:rPr>
+        <w:t>origin</w:t>
+      </w:r>
+      <w:r>
+        <w:t xml:space="preserve"> already exists, </w:t>
       </w:r>
       <w:r>
         <w:rPr>
           <w:rStyle w:val="Strong"/>
         </w:rPr>
-        <w:t>Accounts</w:t>
-      </w:r>
-      <w:r>
-        <w:t xml:space="preserve"> icon (top-right) → </w:t>
-      </w:r>
-      <w:r>
-        <w:rPr>
-          <w:rStyle w:val="Strong"/>
-        </w:rPr>
-        <w:t>Sign in to GitHub</w:t>
-      </w:r>
-      <w:r>
-        <w:t>.</w:t>
-      </w:r>
-    </w:p>
-    <w:p>
-      <w:pPr>
-        <w:pStyle w:val="NormalWeb"/>
-        <w:numPr>
-          <w:ilvl w:val="1"/>
-          <w:numId w:val="13"/>
-        </w:numPr>
-      </w:pPr>
-      <w:r>
-        <w:t xml:space="preserve">or press </w:t>
-      </w:r>
-      <w:r>
-        <w:rPr>
-          <w:rStyle w:val="Strong"/>
-        </w:rPr>
-        <w:t>Ctrl+Shift+P</w:t>
-      </w:r>
-      <w:r>
-        <w:t xml:space="preserve"> → type </w:t>
-      </w:r>
-      <w:r>
-        <w:rPr>
-          <w:rStyle w:val="Strong"/>
-        </w:rPr>
-        <w:t>“GitHub: Sign in”</w:t>
-      </w:r>
-      <w:r>
-        <w:t xml:space="preserve"> → Enter.</w:t>
+        <w:t>Git: Set Remote URL</w:t>
       </w:r>
     </w:p>
     <w:p>
@@ -4563,22 +4468,51 @@
         <w:pStyle w:val="NormalWeb"/>
         <w:numPr>
           <w:ilvl w:val="0"/>
-          <w:numId w:val="13"/>
+          <w:numId w:val="27"/>
         </w:numPr>
       </w:pPr>
       <w:r>
-        <w:t>A browser window opens. Authorize VS Code to access your GitHub.</w:t>
-      </w:r>
-      <w:r>
-        <w:br/>
-        <w:t>When it returns to VS Code, you should see your GitHub avatar in the Accounts area.</w:t>
-      </w:r>
-    </w:p>
-    <w:p>
-      <w:r>
-        <w:pict w14:anchorId="6C94B5C7">
-          <v:rect id="_x0000_i1057" style="width:0;height:1.5pt" o:hralign="center" o:hrstd="t" o:hr="t" fillcolor="#a0a0a0" stroked="f"/>
-        </w:pict>
+        <w:t>Use URL:</w:t>
+      </w:r>
+    </w:p>
+    <w:p>
+      <w:pPr>
+        <w:pStyle w:val="HTMLPreformatted"/>
+        <w:ind w:left="720"/>
+      </w:pPr>
+      <w:r>
+        <w:rPr>
+          <w:rStyle w:val="HTMLCode"/>
+        </w:rPr>
+        <w:t>https:</w:t>
+      </w:r>
+      <w:r>
+        <w:rPr>
+          <w:rStyle w:val="hljs-comment"/>
+        </w:rPr>
+        <w:t>//github.com/miladkasirian/miladkasirian.github.io.git</w:t>
+      </w:r>
+    </w:p>
+    <w:p>
+      <w:pPr>
+        <w:pStyle w:val="NormalWeb"/>
+      </w:pPr>
+    </w:p>
+    <w:p>
+      <w:pPr>
+        <w:pStyle w:val="NormalWeb"/>
+      </w:pPr>
+      <w:r>
+        <w:t xml:space="preserve">Yep—let’s verify what your repo is pointing to </w:t>
+      </w:r>
+      <w:r>
+        <w:rPr>
+          <w:rStyle w:val="Strong"/>
+        </w:rPr>
+        <w:t>before</w:t>
+      </w:r>
+      <w:r>
+        <w:t xml:space="preserve"> you push.</w:t>
       </w:r>
     </w:p>
     <w:p>
@@ -4586,7 +4520,7 @@
         <w:pStyle w:val="Heading2"/>
       </w:pPr>
       <w:r>
-        <w:t>2) Initialize a Git repository (local)</w:t>
+        <w:t>Fastest check (inside VS Code’s built-in terminal)</w:t>
       </w:r>
     </w:p>
     <w:p>
@@ -4594,20 +4528,20 @@
         <w:pStyle w:val="NormalWeb"/>
         <w:numPr>
           <w:ilvl w:val="0"/>
-          <w:numId w:val="14"/>
+          <w:numId w:val="28"/>
         </w:numPr>
       </w:pPr>
       <w:r>
-        <w:t xml:space="preserve">In the left sidebar, click </w:t>
+        <w:t xml:space="preserve">In VS Code, go to </w:t>
       </w:r>
       <w:r>
         <w:rPr>
           <w:rStyle w:val="Strong"/>
         </w:rPr>
-        <w:t>Source Control</w:t>
-      </w:r>
-      <w:r>
-        <w:t xml:space="preserve"> (branch icon).</w:t>
+        <w:t>Terminal → New Terminal</w:t>
+      </w:r>
+      <w:r>
+        <w:t xml:space="preserve"> (bottom panel opens in your project folder).</w:t>
       </w:r>
     </w:p>
     <w:p>
@@ -4615,72 +4549,158 @@
         <w:pStyle w:val="NormalWeb"/>
         <w:numPr>
           <w:ilvl w:val="0"/>
-          <w:numId w:val="14"/>
+          <w:numId w:val="28"/>
         </w:numPr>
       </w:pPr>
       <w:r>
-        <w:t xml:space="preserve">Click </w:t>
-      </w:r>
+        <w:t>Run these:</w:t>
+      </w:r>
+    </w:p>
+    <w:p>
+      <w:pPr>
+        <w:pStyle w:val="HTMLPreformatted"/>
+        <w:rPr>
+          <w:rStyle w:val="HTMLCode"/>
+        </w:rPr>
+      </w:pPr>
+      <w:r>
+        <w:rPr>
+          <w:rStyle w:val="HTMLCode"/>
+        </w:rPr>
+        <w:t># List remotes and their URLs</w:t>
+      </w:r>
+    </w:p>
+    <w:p>
+      <w:pPr>
+        <w:pStyle w:val="HTMLPreformatted"/>
+        <w:rPr>
+          <w:rStyle w:val="HTMLCode"/>
+        </w:rPr>
+      </w:pPr>
+      <w:r>
+        <w:rPr>
+          <w:rStyle w:val="HTMLCode"/>
+        </w:rPr>
+        <w:t>git remote -v</w:t>
+      </w:r>
+    </w:p>
+    <w:p>
+      <w:pPr>
+        <w:pStyle w:val="HTMLPreformatted"/>
+        <w:rPr>
+          <w:rStyle w:val="HTMLCode"/>
+        </w:rPr>
+      </w:pPr>
+    </w:p>
+    <w:p>
+      <w:pPr>
+        <w:pStyle w:val="HTMLPreformatted"/>
+        <w:rPr>
+          <w:rStyle w:val="HTMLCode"/>
+        </w:rPr>
+      </w:pPr>
+      <w:r>
+        <w:rPr>
+          <w:rStyle w:val="HTMLCode"/>
+        </w:rPr>
+        <w:t># See just the URL for 'origin'</w:t>
+      </w:r>
+    </w:p>
+    <w:p>
+      <w:pPr>
+        <w:pStyle w:val="HTMLPreformatted"/>
+        <w:rPr>
+          <w:rStyle w:val="HTMLCode"/>
+        </w:rPr>
+      </w:pPr>
+      <w:r>
+        <w:rPr>
+          <w:rStyle w:val="HTMLCode"/>
+        </w:rPr>
+        <w:t>git remote get-url origin</w:t>
+      </w:r>
+    </w:p>
+    <w:p>
+      <w:pPr>
+        <w:pStyle w:val="HTMLPreformatted"/>
+        <w:rPr>
+          <w:rStyle w:val="HTMLCode"/>
+        </w:rPr>
+      </w:pPr>
+    </w:p>
+    <w:p>
+      <w:pPr>
+        <w:pStyle w:val="HTMLPreformatted"/>
+        <w:rPr>
+          <w:rStyle w:val="HTMLCode"/>
+        </w:rPr>
+      </w:pPr>
+      <w:r>
+        <w:rPr>
+          <w:rStyle w:val="HTMLCode"/>
+        </w:rPr>
+        <w:t># See your current branch and whether it tracks a remote</w:t>
+      </w:r>
+    </w:p>
+    <w:p>
+      <w:pPr>
+        <w:pStyle w:val="HTMLPreformatted"/>
+        <w:rPr>
+          <w:rStyle w:val="HTMLCode"/>
+        </w:rPr>
+      </w:pPr>
+      <w:r>
+        <w:rPr>
+          <w:rStyle w:val="HTMLCode"/>
+        </w:rPr>
+        <w:t>git branch -vv</w:t>
+      </w:r>
+    </w:p>
+    <w:p>
+      <w:pPr>
+        <w:pStyle w:val="HTMLPreformatted"/>
+        <w:rPr>
+          <w:rStyle w:val="HTMLCode"/>
+        </w:rPr>
+      </w:pPr>
+    </w:p>
+    <w:p>
+      <w:pPr>
+        <w:pStyle w:val="HTMLPreformatted"/>
+        <w:rPr>
+          <w:rStyle w:val="HTMLCode"/>
+        </w:rPr>
+      </w:pPr>
+      <w:r>
+        <w:rPr>
+          <w:rStyle w:val="HTMLCode"/>
+        </w:rPr>
+        <w:t># If you want to check the configured upstream explicitly:</w:t>
+      </w:r>
+    </w:p>
+    <w:p>
+      <w:pPr>
+        <w:pStyle w:val="HTMLPreformatted"/>
+        <w:rPr>
+          <w:rStyle w:val="HTMLCode"/>
+        </w:rPr>
+      </w:pPr>
+      <w:r>
+        <w:rPr>
+          <w:rStyle w:val="HTMLCode"/>
+        </w:rPr>
+        <w:t>git rev-parse --abbrev-ref --symbolic-full-name @{u}</w:t>
+      </w:r>
+    </w:p>
+    <w:p>
+      <w:pPr>
+        <w:pStyle w:val="NormalWeb"/>
+      </w:pPr>
       <w:r>
         <w:rPr>
           <w:rStyle w:val="Strong"/>
         </w:rPr>
-        <w:t>Initialize Repository</w:t>
-      </w:r>
-      <w:r>
-        <w:t xml:space="preserve"> (big blue button).</w:t>
-      </w:r>
-    </w:p>
-    <w:p>
-      <w:pPr>
-        <w:pStyle w:val="NormalWeb"/>
-        <w:numPr>
-          <w:ilvl w:val="1"/>
-          <w:numId w:val="14"/>
-        </w:numPr>
-      </w:pPr>
-      <w:r>
-        <w:t>If you don’t see it, the folder might already be a Git repo; skip to step 3.</w:t>
-      </w:r>
-    </w:p>
-    <w:p>
-      <w:pPr>
-        <w:pStyle w:val="NormalWeb"/>
-      </w:pPr>
-      <w:r>
-        <w:t>This creates a local Git repo in your folder.</w:t>
-      </w:r>
-    </w:p>
-    <w:p>
-      <w:r>
-        <w:pict w14:anchorId="200E7886">
-          <v:rect id="_x0000_i1058" style="width:0;height:1.5pt" o:hralign="center" o:hrstd="t" o:hr="t" fillcolor="#a0a0a0" stroked="f"/>
-        </w:pict>
-      </w:r>
-    </w:p>
-    <w:p>
-      <w:pPr>
-        <w:pStyle w:val="Heading2"/>
-      </w:pPr>
-      <w:r>
-        <w:t>3) Link your local folder to your GitHub repo (set “origin”)</w:t>
-      </w:r>
-    </w:p>
-    <w:p>
-      <w:pPr>
-        <w:pStyle w:val="NormalWeb"/>
-      </w:pPr>
-      <w:r>
-        <w:t xml:space="preserve">You already created the GitHub repo named </w:t>
-      </w:r>
-      <w:r>
-        <w:rPr>
-          <w:rStyle w:val="Strong"/>
-        </w:rPr>
-        <w:t>miladkasirian.github.io</w:t>
-      </w:r>
-      <w:r>
-        <w:t>, so we’ll connect to it:</w:t>
+        <w:t>What you want to see</w:t>
       </w:r>
     </w:p>
     <w:p>
@@ -4688,29 +4708,23 @@
         <w:pStyle w:val="NormalWeb"/>
         <w:numPr>
           <w:ilvl w:val="0"/>
-          <w:numId w:val="15"/>
+          <w:numId w:val="29"/>
         </w:numPr>
       </w:pPr>
       <w:r>
-        <w:t xml:space="preserve">Press </w:t>
-      </w:r>
-      <w:r>
-        <w:rPr>
-          <w:rStyle w:val="Strong"/>
-        </w:rPr>
-        <w:t>Ctrl+Shift+P</w:t>
-      </w:r>
-      <w:r>
-        <w:t xml:space="preserve"> → type </w:t>
-      </w:r>
-      <w:r>
-        <w:rPr>
-          <w:rStyle w:val="Strong"/>
-        </w:rPr>
-        <w:t>“Git: Add Remote”</w:t>
-      </w:r>
-      <w:r>
-        <w:t xml:space="preserve"> → Enter.</w:t>
+        <w:rPr>
+          <w:rStyle w:val="HTMLCode"/>
+        </w:rPr>
+        <w:t>origin</w:t>
+      </w:r>
+      <w:r>
+        <w:t xml:space="preserve"> → </w:t>
+      </w:r>
+      <w:r>
+        <w:rPr>
+          <w:rStyle w:val="HTMLCode"/>
+        </w:rPr>
+        <w:t>https://github.com/miladkasirian/miladkasirian.github.io.git</w:t>
       </w:r>
     </w:p>
     <w:p>
@@ -4718,26 +4732,20 @@
         <w:pStyle w:val="NormalWeb"/>
         <w:numPr>
           <w:ilvl w:val="0"/>
-          <w:numId w:val="15"/>
+          <w:numId w:val="29"/>
         </w:numPr>
       </w:pPr>
       <w:r>
-        <w:rPr>
-          <w:rStyle w:val="Strong"/>
-        </w:rPr>
-        <w:t>Remote name:</w:t>
-      </w:r>
-      <w:r>
-        <w:t xml:space="preserve"> type </w:t>
-      </w:r>
-      <w:r>
-        <w:rPr>
-          <w:rStyle w:val="HTMLCode"/>
-        </w:rPr>
-        <w:t>origin</w:t>
-      </w:r>
-      <w:r>
-        <w:t xml:space="preserve"> → Enter.</w:t>
+        <w:t xml:space="preserve">Current branch should be </w:t>
+      </w:r>
+      <w:r>
+        <w:rPr>
+          <w:rStyle w:val="HTMLCode"/>
+        </w:rPr>
+        <w:t>main</w:t>
+      </w:r>
+      <w:r>
+        <w:t xml:space="preserve"> (or your chosen branch).</w:t>
       </w:r>
     </w:p>
     <w:p>
@@ -4745,38 +4753,93 @@
         <w:pStyle w:val="NormalWeb"/>
         <w:numPr>
           <w:ilvl w:val="0"/>
-          <w:numId w:val="15"/>
+          <w:numId w:val="29"/>
         </w:numPr>
       </w:pPr>
       <w:r>
+        <w:t xml:space="preserve">If </w:t>
+      </w:r>
+      <w:r>
+        <w:rPr>
+          <w:rStyle w:val="HTMLCode"/>
+        </w:rPr>
+        <w:t>@{u}</w:t>
+      </w:r>
+      <w:r>
+        <w:t xml:space="preserve"> prints an error like “no upstream configured,” that just means you haven’t pushed yet—that’s normal.</w:t>
+      </w:r>
+    </w:p>
+    <w:p/>
+    <w:p/>
+    <w:p>
+      <w:pPr>
+        <w:pStyle w:val="NormalWeb"/>
+      </w:pPr>
+      <w:r>
+        <w:t xml:space="preserve">Great—your remote is still pointing to the old repo. Let’s fix that and (very likely) put your website files at the </w:t>
+      </w:r>
+      <w:r>
         <w:rPr>
           <w:rStyle w:val="Strong"/>
         </w:rPr>
-        <w:t>Remote URL:</w:t>
-      </w:r>
-      <w:r>
-        <w:t xml:space="preserve"> paste this exact URL and press Enter:</w:t>
+        <w:t>repo root</w:t>
+      </w:r>
+      <w:r>
+        <w:t xml:space="preserve"> so Pages can serve them.</w:t>
+      </w:r>
+    </w:p>
+    <w:p>
+      <w:pPr>
+        <w:pStyle w:val="Heading3"/>
+      </w:pPr>
+      <w:r>
+        <w:t>1) Point the repo to the correct remote</w:t>
+      </w:r>
+    </w:p>
+    <w:p>
+      <w:pPr>
+        <w:pStyle w:val="NormalWeb"/>
+      </w:pPr>
+      <w:r>
+        <w:t xml:space="preserve">In the </w:t>
+      </w:r>
+      <w:r>
+        <w:rPr>
+          <w:rStyle w:val="Strong"/>
+        </w:rPr>
+        <w:t>same PowerShell</w:t>
+      </w:r>
+      <w:r>
+        <w:t xml:space="preserve"> (or VS Code Terminal) you used, run:</w:t>
       </w:r>
     </w:p>
     <w:p>
       <w:pPr>
         <w:pStyle w:val="HTMLPreformatted"/>
-        <w:numPr>
-          <w:ilvl w:val="0"/>
-          <w:numId w:val="15"/>
-        </w:numPr>
-        <w:tabs>
-          <w:tab w:val="clear" w:pos="720"/>
-        </w:tabs>
-        <w:rPr>
-          <w:rStyle w:val="HTMLCode"/>
-        </w:rPr>
-      </w:pPr>
-      <w:r>
-        <w:rPr>
-          <w:rStyle w:val="HTMLCode"/>
-        </w:rPr>
-        <w:t>https://github.com/miladkasirian/miladkasirian.github.io.git</w:t>
+        <w:rPr>
+          <w:rStyle w:val="HTMLCode"/>
+        </w:rPr>
+      </w:pPr>
+      <w:r>
+        <w:rPr>
+          <w:rStyle w:val="HTMLCode"/>
+        </w:rPr>
+        <w:lastRenderedPageBreak/>
+        <w:t>git remote set-url origin https://github.com/miladkasirian/miladkasirian.github.io.git</w:t>
+      </w:r>
+    </w:p>
+    <w:p>
+      <w:pPr>
+        <w:pStyle w:val="HTMLPreformatted"/>
+        <w:rPr>
+          <w:rStyle w:val="HTMLCode"/>
+        </w:rPr>
+      </w:pPr>
+      <w:r>
+        <w:rPr>
+          <w:rStyle w:val="HTMLCode"/>
+        </w:rPr>
+        <w:t>git remote -v</w:t>
       </w:r>
     </w:p>
     <w:p>
@@ -4784,584 +4847,66 @@
         <w:pStyle w:val="NormalWeb"/>
       </w:pPr>
       <w:r>
-        <w:rPr>
-          <w:rStyle w:val="Emphasis"/>
-        </w:rPr>
-        <w:t xml:space="preserve">(If you accidentally click “Publish to GitHub” and it tries to create a brand-new repo, cancel that flow; you already have the repo. Use </w:t>
-      </w:r>
-      <w:r>
-        <w:rPr>
-          <w:rStyle w:val="Strong"/>
-          <w:i/>
-          <w:iCs/>
-        </w:rPr>
-        <w:t>Git: Add Remote</w:t>
-      </w:r>
-      <w:r>
-        <w:rPr>
-          <w:rStyle w:val="Emphasis"/>
-        </w:rPr>
-        <w:t xml:space="preserve"> instead.)</w:t>
-      </w:r>
-    </w:p>
-    <w:p>
-      <w:r>
-        <w:lastRenderedPageBreak/>
-        <w:pict w14:anchorId="66326F70">
-          <v:rect id="_x0000_i1059" style="width:0;height:1.5pt" o:hralign="center" o:hrstd="t" o:hr="t" fillcolor="#a0a0a0" stroked="f"/>
-        </w:pict>
-      </w:r>
-    </w:p>
-    <w:p>
-      <w:pPr>
-        <w:pStyle w:val="Heading2"/>
-      </w:pPr>
-      <w:r>
-        <w:t>4) Make your first commit (UI only)</w:t>
-      </w:r>
-    </w:p>
-    <w:p>
-      <w:pPr>
-        <w:pStyle w:val="NormalWeb"/>
-        <w:numPr>
-          <w:ilvl w:val="0"/>
-          <w:numId w:val="16"/>
-        </w:numPr>
-      </w:pPr>
-      <w:r>
-        <w:t xml:space="preserve">In </w:t>
-      </w:r>
-      <w:r>
-        <w:rPr>
-          <w:rStyle w:val="Strong"/>
-        </w:rPr>
-        <w:t>Source Control</w:t>
-      </w:r>
-      <w:r>
-        <w:t xml:space="preserve">, you’ll see your changed files (e.g., </w:t>
-      </w:r>
-      <w:r>
-        <w:rPr>
-          <w:rStyle w:val="HTMLCode"/>
-        </w:rPr>
-        <w:t>index.html</w:t>
-      </w:r>
-      <w:r>
-        <w:t>).</w:t>
-      </w:r>
-    </w:p>
-    <w:p>
-      <w:pPr>
-        <w:pStyle w:val="NormalWeb"/>
-        <w:numPr>
-          <w:ilvl w:val="0"/>
-          <w:numId w:val="16"/>
-        </w:numPr>
-      </w:pPr>
-      <w:r>
-        <w:t xml:space="preserve">Click </w:t>
-      </w:r>
-      <w:r>
-        <w:rPr>
-          <w:rStyle w:val="Strong"/>
-        </w:rPr>
-        <w:t>+</w:t>
-      </w:r>
-      <w:r>
-        <w:t xml:space="preserve"> next to each file (or </w:t>
-      </w:r>
-      <w:r>
-        <w:rPr>
-          <w:rStyle w:val="Strong"/>
-        </w:rPr>
-        <w:t>Stage All Changes</w:t>
-      </w:r>
-      <w:r>
-        <w:t xml:space="preserve"> from the “…” menu).</w:t>
-      </w:r>
-    </w:p>
-    <w:p>
-      <w:pPr>
-        <w:pStyle w:val="NormalWeb"/>
-        <w:numPr>
-          <w:ilvl w:val="0"/>
-          <w:numId w:val="16"/>
-        </w:numPr>
-      </w:pPr>
-      <w:r>
-        <w:t>In the message box at the top, type:</w:t>
+        <w:t>You should now see:</w:t>
       </w:r>
     </w:p>
     <w:p>
       <w:pPr>
         <w:pStyle w:val="HTMLPreformatted"/>
-        <w:numPr>
-          <w:ilvl w:val="0"/>
-          <w:numId w:val="16"/>
-        </w:numPr>
-        <w:tabs>
-          <w:tab w:val="clear" w:pos="720"/>
-        </w:tabs>
-        <w:rPr>
-          <w:rStyle w:val="HTMLCode"/>
-        </w:rPr>
-      </w:pPr>
-      <w:r>
-        <w:rPr>
-          <w:rStyle w:val="HTMLCode"/>
-        </w:rPr>
-        <w:t>Simplified homepage</w:t>
-      </w:r>
-    </w:p>
-    <w:p>
-      <w:pPr>
-        <w:pStyle w:val="NormalWeb"/>
-        <w:numPr>
-          <w:ilvl w:val="0"/>
-          <w:numId w:val="16"/>
-        </w:numPr>
-      </w:pPr>
-      <w:r>
-        <w:t xml:space="preserve">Click </w:t>
-      </w:r>
-      <w:r>
-        <w:rPr>
-          <w:rStyle w:val="Strong"/>
-        </w:rPr>
-        <w:t>Commit</w:t>
-      </w:r>
-      <w:r>
-        <w:t xml:space="preserve"> (</w:t>
-      </w:r>
-      <w:r>
-        <w:rPr>
-          <w:rFonts w:ascii="Segoe UI Symbol" w:hAnsi="Segoe UI Symbol" w:cs="Segoe UI Symbol"/>
-        </w:rPr>
-        <w:t>✓</w:t>
-      </w:r>
-      <w:r>
-        <w:t>) in the Source Control title bar.</w:t>
-      </w:r>
-    </w:p>
-    <w:p>
-      <w:r>
-        <w:pict w14:anchorId="37EA15D2">
-          <v:rect id="_x0000_i1060" style="width:0;height:1.5pt" o:hralign="center" o:hrstd="t" o:hr="t" fillcolor="#a0a0a0" stroked="f"/>
-        </w:pict>
-      </w:r>
-    </w:p>
-    <w:p>
-      <w:pPr>
-        <w:pStyle w:val="Heading2"/>
-      </w:pPr>
-      <w:r>
-        <w:t>5) Push to GitHub (first time)</w:t>
-      </w:r>
-    </w:p>
-    <w:p>
-      <w:pPr>
-        <w:pStyle w:val="NormalWeb"/>
-        <w:numPr>
-          <w:ilvl w:val="0"/>
-          <w:numId w:val="17"/>
-        </w:numPr>
-      </w:pPr>
-      <w:r>
-        <w:t xml:space="preserve">In the bottom status bar or in </w:t>
-      </w:r>
-      <w:r>
-        <w:rPr>
-          <w:rStyle w:val="Strong"/>
-        </w:rPr>
-        <w:t>Source Control</w:t>
-      </w:r>
-      <w:r>
-        <w:t xml:space="preserve">, click </w:t>
-      </w:r>
-      <w:r>
-        <w:rPr>
-          <w:rStyle w:val="Strong"/>
-        </w:rPr>
-        <w:t>Publish Branch</w:t>
-      </w:r>
-      <w:r>
-        <w:t xml:space="preserve"> or </w:t>
-      </w:r>
-      <w:r>
-        <w:rPr>
-          <w:rStyle w:val="Strong"/>
-        </w:rPr>
-        <w:t>Sync Changes</w:t>
-      </w:r>
-      <w:r>
-        <w:t>.</w:t>
-      </w:r>
-    </w:p>
-    <w:p>
-      <w:pPr>
-        <w:pStyle w:val="NormalWeb"/>
-        <w:numPr>
-          <w:ilvl w:val="1"/>
-          <w:numId w:val="17"/>
-        </w:numPr>
-      </w:pPr>
-      <w:r>
-        <w:t xml:space="preserve">If VS Code asks for a branch name, choose </w:t>
-      </w:r>
-      <w:r>
-        <w:rPr>
-          <w:rStyle w:val="Strong"/>
-        </w:rPr>
-        <w:t>main</w:t>
-      </w:r>
-      <w:r>
-        <w:t xml:space="preserve"> (or it might default to </w:t>
-      </w:r>
-      <w:r>
-        <w:rPr>
-          <w:rStyle w:val="HTMLCode"/>
-        </w:rPr>
-        <w:t>master</w:t>
-      </w:r>
-      <w:r>
-        <w:t xml:space="preserve">; if so, from the “…” menu choose </w:t>
-      </w:r>
-      <w:r>
-        <w:rPr>
-          <w:rStyle w:val="Strong"/>
-        </w:rPr>
-        <w:t>Branch → Rename</w:t>
-      </w:r>
-      <w:r>
-        <w:t xml:space="preserve"> to </w:t>
-      </w:r>
-      <w:r>
-        <w:rPr>
-          <w:rStyle w:val="HTMLCode"/>
-        </w:rPr>
-        <w:t>main</w:t>
-      </w:r>
-      <w:r>
-        <w:t xml:space="preserve"> first).</w:t>
-      </w:r>
-    </w:p>
-    <w:p>
-      <w:pPr>
-        <w:pStyle w:val="NormalWeb"/>
-        <w:numPr>
-          <w:ilvl w:val="0"/>
-          <w:numId w:val="17"/>
-        </w:numPr>
-      </w:pPr>
-      <w:r>
-        <w:t xml:space="preserve">If prompted, confirm </w:t>
-      </w:r>
-      <w:r>
-        <w:rPr>
-          <w:rStyle w:val="Strong"/>
-        </w:rPr>
-        <w:t>Set upstream</w:t>
-      </w:r>
-      <w:r>
-        <w:t>.</w:t>
-      </w:r>
-    </w:p>
-    <w:p>
-      <w:pPr>
-        <w:pStyle w:val="NormalWeb"/>
-      </w:pPr>
-      <w:r>
-        <w:t xml:space="preserve">VS Code will push your local </w:t>
-      </w:r>
-      <w:r>
-        <w:rPr>
-          <w:rStyle w:val="HTMLCode"/>
-        </w:rPr>
-        <w:t>main</w:t>
-      </w:r>
-      <w:r>
-        <w:t xml:space="preserve"> to the GitHub repo we set as </w:t>
-      </w:r>
-      <w:r>
-        <w:rPr>
-          <w:rStyle w:val="HTMLCode"/>
-        </w:rPr>
-        <w:t>origin</w:t>
-      </w:r>
-      <w:r>
-        <w:t>.</w:t>
-      </w:r>
-    </w:p>
-    <w:p>
-      <w:r>
-        <w:pict w14:anchorId="2A53F5FA">
-          <v:rect id="_x0000_i1061" style="width:0;height:1.5pt" o:hralign="center" o:hrstd="t" o:hr="t" fillcolor="#a0a0a0" stroked="f"/>
-        </w:pict>
-      </w:r>
-    </w:p>
-    <w:p>
-      <w:pPr>
-        <w:pStyle w:val="Heading2"/>
-      </w:pPr>
-      <w:r>
-        <w:t>6) Verify your site</w:t>
-      </w:r>
-    </w:p>
-    <w:p>
-      <w:pPr>
-        <w:pStyle w:val="NormalWeb"/>
-        <w:numPr>
-          <w:ilvl w:val="0"/>
-          <w:numId w:val="18"/>
-        </w:numPr>
-      </w:pPr>
-      <w:r>
-        <w:t xml:space="preserve">Wait ~1–2 minutes, then open: </w:t>
-      </w:r>
-      <w:hyperlink r:id="rId11" w:history="1">
-        <w:r>
-          <w:rPr>
-            <w:rStyle w:val="Hyperlink"/>
-            <w:rFonts w:eastAsiaTheme="majorEastAsia"/>
-            <w:b/>
-            <w:bCs/>
-          </w:rPr>
-          <w:t>https://miladkasirian.github.io/</w:t>
-        </w:r>
-      </w:hyperlink>
-    </w:p>
-    <w:p>
-      <w:pPr>
-        <w:pStyle w:val="NormalWeb"/>
-        <w:numPr>
-          <w:ilvl w:val="0"/>
-          <w:numId w:val="18"/>
-        </w:numPr>
-      </w:pPr>
-      <w:r>
-        <w:t>If you see a 404 initially, refresh after a minute.</w:t>
-      </w:r>
-      <w:r>
-        <w:br/>
-        <w:t xml:space="preserve">(For user pages named </w:t>
-      </w:r>
-      <w:r>
-        <w:rPr>
-          <w:rStyle w:val="HTMLCode"/>
-        </w:rPr>
-        <w:t>username.github.io</w:t>
-      </w:r>
-      <w:r>
-        <w:t xml:space="preserve">, GitHub Pages serves from the root of </w:t>
-      </w:r>
-      <w:r>
-        <w:rPr>
-          <w:rStyle w:val="HTMLCode"/>
-        </w:rPr>
-        <w:t>main</w:t>
-      </w:r>
-      <w:r>
-        <w:t xml:space="preserve"> automatically.)</w:t>
-      </w:r>
-    </w:p>
-    <w:p>
-      <w:pPr>
-        <w:pStyle w:val="NormalWeb"/>
-      </w:pPr>
-      <w:r>
-        <w:t>Optional check:</w:t>
-      </w:r>
-    </w:p>
-    <w:p>
-      <w:pPr>
-        <w:pStyle w:val="NormalWeb"/>
-        <w:numPr>
-          <w:ilvl w:val="0"/>
-          <w:numId w:val="19"/>
-        </w:numPr>
-      </w:pPr>
-      <w:r>
-        <w:t xml:space="preserve">On GitHub, open your repo → </w:t>
-      </w:r>
-      <w:r>
-        <w:rPr>
-          <w:rStyle w:val="Strong"/>
-        </w:rPr>
-        <w:t>Settings → Pages</w:t>
-      </w:r>
-      <w:r>
-        <w:t>. It should show your site is live.</w:t>
-      </w:r>
-    </w:p>
-    <w:p>
-      <w:r>
-        <w:pict w14:anchorId="721045BE">
-          <v:rect id="_x0000_i1062" style="width:0;height:1.5pt" o:hralign="center" o:hrstd="t" o:hr="t" fillcolor="#a0a0a0" stroked="f"/>
-        </w:pict>
-      </w:r>
-    </w:p>
-    <w:p>
-      <w:pPr>
-        <w:pStyle w:val="Heading2"/>
-      </w:pPr>
-      <w:r>
-        <w:t>7) Future edits (all in VS Code)</w:t>
-      </w:r>
-    </w:p>
-    <w:p>
-      <w:pPr>
-        <w:pStyle w:val="NormalWeb"/>
-        <w:numPr>
-          <w:ilvl w:val="0"/>
-          <w:numId w:val="20"/>
-        </w:numPr>
-      </w:pPr>
-      <w:r>
-        <w:t xml:space="preserve">Edit files → </w:t>
-      </w:r>
-      <w:r>
-        <w:rPr>
-          <w:rStyle w:val="Strong"/>
-        </w:rPr>
-        <w:t>Source Control</w:t>
-      </w:r>
-      <w:r>
-        <w:t xml:space="preserve">: Stage </w:t>
-      </w:r>
-      <w:r>
-        <w:rPr>
-          <w:rStyle w:val="Strong"/>
-        </w:rPr>
-        <w:t>+</w:t>
-      </w:r>
-      <w:r>
-        <w:t xml:space="preserve">, write a message, </w:t>
-      </w:r>
-      <w:r>
-        <w:rPr>
-          <w:rStyle w:val="Strong"/>
-        </w:rPr>
-        <w:t>Commit</w:t>
-      </w:r>
-      <w:r>
-        <w:t xml:space="preserve">, then </w:t>
-      </w:r>
-      <w:r>
-        <w:rPr>
-          <w:rStyle w:val="Strong"/>
-        </w:rPr>
-        <w:t>Sync/Push</w:t>
-      </w:r>
-      <w:r>
-        <w:t>.</w:t>
-      </w:r>
-    </w:p>
-    <w:p>
-      <w:pPr>
-        <w:pStyle w:val="NormalWeb"/>
-        <w:numPr>
-          <w:ilvl w:val="0"/>
-          <w:numId w:val="20"/>
-        </w:numPr>
-      </w:pPr>
-      <w:r>
-        <w:t>Your site auto-updates in ~1–2 minutes.</w:t>
-      </w:r>
-    </w:p>
-    <w:p>
-      <w:r>
-        <w:pict w14:anchorId="755086A0">
-          <v:rect id="_x0000_i1063" style="width:0;height:1.5pt" o:hralign="center" o:hrstd="t" o:hr="t" fillcolor="#a0a0a0" stroked="f"/>
-        </w:pict>
+        <w:rPr>
+          <w:rStyle w:val="HTMLCode"/>
+        </w:rPr>
+      </w:pPr>
+      <w:r>
+        <w:rPr>
+          <w:rStyle w:val="HTMLCode"/>
+        </w:rPr>
+        <w:t>origin  https://github.com/miladkasirian/miladkasirian.github.io.git (fetch)</w:t>
+      </w:r>
+    </w:p>
+    <w:p>
+      <w:pPr>
+        <w:pStyle w:val="HTMLPreformatted"/>
+        <w:rPr>
+          <w:rStyle w:val="HTMLCode"/>
+        </w:rPr>
+      </w:pPr>
+      <w:r>
+        <w:rPr>
+          <w:rStyle w:val="HTMLCode"/>
+        </w:rPr>
+        <w:t>origin  https://github.com/miladkasirian/miladkasirian.github.io.git (push)</w:t>
       </w:r>
     </w:p>
     <w:p>
       <w:pPr>
         <w:pStyle w:val="Heading3"/>
       </w:pPr>
-      <w:r>
-        <w:lastRenderedPageBreak/>
-        <w:t>Troubleshooting (VS Code only)</w:t>
-      </w:r>
-    </w:p>
-    <w:p>
-      <w:pPr>
-        <w:pStyle w:val="NormalWeb"/>
-        <w:numPr>
-          <w:ilvl w:val="0"/>
-          <w:numId w:val="21"/>
-        </w:numPr>
-      </w:pPr>
-      <w:r>
-        <w:rPr>
-          <w:rStyle w:val="Strong"/>
-        </w:rPr>
-        <w:t>“Publish Branch” creates a new repo by mistake</w:t>
-      </w:r>
-      <w:r>
-        <w:t xml:space="preserve"> → Cancel. Use </w:t>
-      </w:r>
-      <w:r>
-        <w:rPr>
-          <w:rStyle w:val="Strong"/>
-        </w:rPr>
-        <w:t>Ctrl+Shift+P → Git: Add Remote</w:t>
-      </w:r>
-      <w:r>
-        <w:t xml:space="preserve"> to point to the existing repo URL above, then </w:t>
-      </w:r>
-      <w:r>
-        <w:rPr>
-          <w:rStyle w:val="Strong"/>
-        </w:rPr>
-        <w:t>Sync/Push</w:t>
-      </w:r>
-      <w:r>
-        <w:t>.</w:t>
-      </w:r>
-    </w:p>
-    <w:p>
-      <w:pPr>
-        <w:pStyle w:val="NormalWeb"/>
-        <w:numPr>
-          <w:ilvl w:val="0"/>
-          <w:numId w:val="21"/>
-        </w:numPr>
-      </w:pPr>
-      <w:r>
-        <w:rPr>
-          <w:rStyle w:val="Strong"/>
-        </w:rPr>
-        <w:t>No “Initialize Repository” button</w:t>
-      </w:r>
-      <w:r>
-        <w:t xml:space="preserve"> → it’s already a Git repo; jump to step 3 or 4.</w:t>
-      </w:r>
-    </w:p>
-    <w:p>
-      <w:pPr>
-        <w:pStyle w:val="NormalWeb"/>
-        <w:numPr>
-          <w:ilvl w:val="0"/>
-          <w:numId w:val="21"/>
-        </w:numPr>
-      </w:pPr>
-      <w:r>
-        <w:rPr>
-          <w:rStyle w:val="Strong"/>
-        </w:rPr>
-        <w:t>Auth prompt</w:t>
-      </w:r>
-      <w:r>
-        <w:t xml:space="preserve"> → sign in with GitHub (you already did in step 1). If it asks for a token, let VS Code open the browser to grant access.</w:t>
-      </w:r>
-    </w:p>
-    <w:p>
-      <w:pPr>
-        <w:pStyle w:val="NormalWeb"/>
-      </w:pPr>
-      <w:r>
-        <w:t>If you tell me what you see in the Source Control panel right now (buttons/text), I’ll guide the exact clicks from there.</w:t>
+    </w:p>
+    <w:p/>
+    <w:p>
+      <w:r>
+        <w:t>in vscode terminal:</w:t>
+      </w:r>
+    </w:p>
+    <w:p>
+      <w:r>
+        <w:t>git add .</w:t>
+      </w:r>
+    </w:p>
+    <w:p>
+      <w:r>
+        <w:t>git commit -m "Initial publish to correct repo"</w:t>
+      </w:r>
+    </w:p>
+    <w:p>
+      <w:r>
+        <w:t>git branch -M main</w:t>
+      </w:r>
+    </w:p>
+    <w:p>
+      <w:r>
+        <w:t>git push -u origin main</w:t>
       </w:r>
     </w:p>
     <w:p/>
@@ -5757,6 +5302,155 @@
     </w:lvl>
   </w:abstractNum>
   <w:abstractNum w:abstractNumId="3" w15:restartNumberingAfterBreak="0">
+    <w:nsid w:val="03E50597"/>
+    <w:multiLevelType w:val="multilevel"/>
+    <w:tmpl w:val="43C6837E"/>
+    <w:lvl w:ilvl="0">
+      <w:start w:val="1"/>
+      <w:numFmt w:val="bullet"/>
+      <w:lvlText w:val=""/>
+      <w:lvlJc w:val="left"/>
+      <w:pPr>
+        <w:tabs>
+          <w:tab w:val="num" w:pos="720"/>
+        </w:tabs>
+        <w:ind w:left="720" w:hanging="360"/>
+      </w:pPr>
+      <w:rPr>
+        <w:rFonts w:ascii="Symbol" w:hAnsi="Symbol" w:hint="default"/>
+        <w:sz w:val="20"/>
+      </w:rPr>
+    </w:lvl>
+    <w:lvl w:ilvl="1" w:tentative="1">
+      <w:start w:val="1"/>
+      <w:numFmt w:val="bullet"/>
+      <w:lvlText w:val="o"/>
+      <w:lvlJc w:val="left"/>
+      <w:pPr>
+        <w:tabs>
+          <w:tab w:val="num" w:pos="1440"/>
+        </w:tabs>
+        <w:ind w:left="1440" w:hanging="360"/>
+      </w:pPr>
+      <w:rPr>
+        <w:rFonts w:ascii="Courier New" w:hAnsi="Courier New" w:hint="default"/>
+        <w:sz w:val="20"/>
+      </w:rPr>
+    </w:lvl>
+    <w:lvl w:ilvl="2" w:tentative="1">
+      <w:start w:val="1"/>
+      <w:numFmt w:val="bullet"/>
+      <w:lvlText w:val=""/>
+      <w:lvlJc w:val="left"/>
+      <w:pPr>
+        <w:tabs>
+          <w:tab w:val="num" w:pos="2160"/>
+        </w:tabs>
+        <w:ind w:left="2160" w:hanging="360"/>
+      </w:pPr>
+      <w:rPr>
+        <w:rFonts w:ascii="Wingdings" w:hAnsi="Wingdings" w:hint="default"/>
+        <w:sz w:val="20"/>
+      </w:rPr>
+    </w:lvl>
+    <w:lvl w:ilvl="3" w:tentative="1">
+      <w:start w:val="1"/>
+      <w:numFmt w:val="bullet"/>
+      <w:lvlText w:val=""/>
+      <w:lvlJc w:val="left"/>
+      <w:pPr>
+        <w:tabs>
+          <w:tab w:val="num" w:pos="2880"/>
+        </w:tabs>
+        <w:ind w:left="2880" w:hanging="360"/>
+      </w:pPr>
+      <w:rPr>
+        <w:rFonts w:ascii="Wingdings" w:hAnsi="Wingdings" w:hint="default"/>
+        <w:sz w:val="20"/>
+      </w:rPr>
+    </w:lvl>
+    <w:lvl w:ilvl="4" w:tentative="1">
+      <w:start w:val="1"/>
+      <w:numFmt w:val="bullet"/>
+      <w:lvlText w:val=""/>
+      <w:lvlJc w:val="left"/>
+      <w:pPr>
+        <w:tabs>
+          <w:tab w:val="num" w:pos="3600"/>
+        </w:tabs>
+        <w:ind w:left="3600" w:hanging="360"/>
+      </w:pPr>
+      <w:rPr>
+        <w:rFonts w:ascii="Wingdings" w:hAnsi="Wingdings" w:hint="default"/>
+        <w:sz w:val="20"/>
+      </w:rPr>
+    </w:lvl>
+    <w:lvl w:ilvl="5" w:tentative="1">
+      <w:start w:val="1"/>
+      <w:numFmt w:val="bullet"/>
+      <w:lvlText w:val=""/>
+      <w:lvlJc w:val="left"/>
+      <w:pPr>
+        <w:tabs>
+          <w:tab w:val="num" w:pos="4320"/>
+        </w:tabs>
+        <w:ind w:left="4320" w:hanging="360"/>
+      </w:pPr>
+      <w:rPr>
+        <w:rFonts w:ascii="Wingdings" w:hAnsi="Wingdings" w:hint="default"/>
+        <w:sz w:val="20"/>
+      </w:rPr>
+    </w:lvl>
+    <w:lvl w:ilvl="6" w:tentative="1">
+      <w:start w:val="1"/>
+      <w:numFmt w:val="bullet"/>
+      <w:lvlText w:val=""/>
+      <w:lvlJc w:val="left"/>
+      <w:pPr>
+        <w:tabs>
+          <w:tab w:val="num" w:pos="5040"/>
+        </w:tabs>
+        <w:ind w:left="5040" w:hanging="360"/>
+      </w:pPr>
+      <w:rPr>
+        <w:rFonts w:ascii="Wingdings" w:hAnsi="Wingdings" w:hint="default"/>
+        <w:sz w:val="20"/>
+      </w:rPr>
+    </w:lvl>
+    <w:lvl w:ilvl="7" w:tentative="1">
+      <w:start w:val="1"/>
+      <w:numFmt w:val="bullet"/>
+      <w:lvlText w:val=""/>
+      <w:lvlJc w:val="left"/>
+      <w:pPr>
+        <w:tabs>
+          <w:tab w:val="num" w:pos="5760"/>
+        </w:tabs>
+        <w:ind w:left="5760" w:hanging="360"/>
+      </w:pPr>
+      <w:rPr>
+        <w:rFonts w:ascii="Wingdings" w:hAnsi="Wingdings" w:hint="default"/>
+        <w:sz w:val="20"/>
+      </w:rPr>
+    </w:lvl>
+    <w:lvl w:ilvl="8" w:tentative="1">
+      <w:start w:val="1"/>
+      <w:numFmt w:val="bullet"/>
+      <w:lvlText w:val=""/>
+      <w:lvlJc w:val="left"/>
+      <w:pPr>
+        <w:tabs>
+          <w:tab w:val="num" w:pos="6480"/>
+        </w:tabs>
+        <w:ind w:left="6480" w:hanging="360"/>
+      </w:pPr>
+      <w:rPr>
+        <w:rFonts w:ascii="Wingdings" w:hAnsi="Wingdings" w:hint="default"/>
+        <w:sz w:val="20"/>
+      </w:rPr>
+    </w:lvl>
+  </w:abstractNum>
+  <w:abstractNum w:abstractNumId="4" w15:restartNumberingAfterBreak="0">
     <w:nsid w:val="05954CB7"/>
     <w:multiLevelType w:val="multilevel"/>
     <w:tmpl w:val="77A8DB8E"/>
@@ -5869,7 +5563,156 @@
       </w:pPr>
     </w:lvl>
   </w:abstractNum>
-  <w:abstractNum w:abstractNumId="4" w15:restartNumberingAfterBreak="0">
+  <w:abstractNum w:abstractNumId="5" w15:restartNumberingAfterBreak="0">
+    <w:nsid w:val="0BDF0B7C"/>
+    <w:multiLevelType w:val="multilevel"/>
+    <w:tmpl w:val="9AB461F6"/>
+    <w:lvl w:ilvl="0">
+      <w:start w:val="1"/>
+      <w:numFmt w:val="bullet"/>
+      <w:lvlText w:val=""/>
+      <w:lvlJc w:val="left"/>
+      <w:pPr>
+        <w:tabs>
+          <w:tab w:val="num" w:pos="720"/>
+        </w:tabs>
+        <w:ind w:left="720" w:hanging="360"/>
+      </w:pPr>
+      <w:rPr>
+        <w:rFonts w:ascii="Symbol" w:hAnsi="Symbol" w:hint="default"/>
+        <w:sz w:val="20"/>
+      </w:rPr>
+    </w:lvl>
+    <w:lvl w:ilvl="1" w:tentative="1">
+      <w:start w:val="1"/>
+      <w:numFmt w:val="bullet"/>
+      <w:lvlText w:val="o"/>
+      <w:lvlJc w:val="left"/>
+      <w:pPr>
+        <w:tabs>
+          <w:tab w:val="num" w:pos="1440"/>
+        </w:tabs>
+        <w:ind w:left="1440" w:hanging="360"/>
+      </w:pPr>
+      <w:rPr>
+        <w:rFonts w:ascii="Courier New" w:hAnsi="Courier New" w:hint="default"/>
+        <w:sz w:val="20"/>
+      </w:rPr>
+    </w:lvl>
+    <w:lvl w:ilvl="2" w:tentative="1">
+      <w:start w:val="1"/>
+      <w:numFmt w:val="bullet"/>
+      <w:lvlText w:val=""/>
+      <w:lvlJc w:val="left"/>
+      <w:pPr>
+        <w:tabs>
+          <w:tab w:val="num" w:pos="2160"/>
+        </w:tabs>
+        <w:ind w:left="2160" w:hanging="360"/>
+      </w:pPr>
+      <w:rPr>
+        <w:rFonts w:ascii="Wingdings" w:hAnsi="Wingdings" w:hint="default"/>
+        <w:sz w:val="20"/>
+      </w:rPr>
+    </w:lvl>
+    <w:lvl w:ilvl="3" w:tentative="1">
+      <w:start w:val="1"/>
+      <w:numFmt w:val="bullet"/>
+      <w:lvlText w:val=""/>
+      <w:lvlJc w:val="left"/>
+      <w:pPr>
+        <w:tabs>
+          <w:tab w:val="num" w:pos="2880"/>
+        </w:tabs>
+        <w:ind w:left="2880" w:hanging="360"/>
+      </w:pPr>
+      <w:rPr>
+        <w:rFonts w:ascii="Wingdings" w:hAnsi="Wingdings" w:hint="default"/>
+        <w:sz w:val="20"/>
+      </w:rPr>
+    </w:lvl>
+    <w:lvl w:ilvl="4" w:tentative="1">
+      <w:start w:val="1"/>
+      <w:numFmt w:val="bullet"/>
+      <w:lvlText w:val=""/>
+      <w:lvlJc w:val="left"/>
+      <w:pPr>
+        <w:tabs>
+          <w:tab w:val="num" w:pos="3600"/>
+        </w:tabs>
+        <w:ind w:left="3600" w:hanging="360"/>
+      </w:pPr>
+      <w:rPr>
+        <w:rFonts w:ascii="Wingdings" w:hAnsi="Wingdings" w:hint="default"/>
+        <w:sz w:val="20"/>
+      </w:rPr>
+    </w:lvl>
+    <w:lvl w:ilvl="5" w:tentative="1">
+      <w:start w:val="1"/>
+      <w:numFmt w:val="bullet"/>
+      <w:lvlText w:val=""/>
+      <w:lvlJc w:val="left"/>
+      <w:pPr>
+        <w:tabs>
+          <w:tab w:val="num" w:pos="4320"/>
+        </w:tabs>
+        <w:ind w:left="4320" w:hanging="360"/>
+      </w:pPr>
+      <w:rPr>
+        <w:rFonts w:ascii="Wingdings" w:hAnsi="Wingdings" w:hint="default"/>
+        <w:sz w:val="20"/>
+      </w:rPr>
+    </w:lvl>
+    <w:lvl w:ilvl="6" w:tentative="1">
+      <w:start w:val="1"/>
+      <w:numFmt w:val="bullet"/>
+      <w:lvlText w:val=""/>
+      <w:lvlJc w:val="left"/>
+      <w:pPr>
+        <w:tabs>
+          <w:tab w:val="num" w:pos="5040"/>
+        </w:tabs>
+        <w:ind w:left="5040" w:hanging="360"/>
+      </w:pPr>
+      <w:rPr>
+        <w:rFonts w:ascii="Wingdings" w:hAnsi="Wingdings" w:hint="default"/>
+        <w:sz w:val="20"/>
+      </w:rPr>
+    </w:lvl>
+    <w:lvl w:ilvl="7" w:tentative="1">
+      <w:start w:val="1"/>
+      <w:numFmt w:val="bullet"/>
+      <w:lvlText w:val=""/>
+      <w:lvlJc w:val="left"/>
+      <w:pPr>
+        <w:tabs>
+          <w:tab w:val="num" w:pos="5760"/>
+        </w:tabs>
+        <w:ind w:left="5760" w:hanging="360"/>
+      </w:pPr>
+      <w:rPr>
+        <w:rFonts w:ascii="Wingdings" w:hAnsi="Wingdings" w:hint="default"/>
+        <w:sz w:val="20"/>
+      </w:rPr>
+    </w:lvl>
+    <w:lvl w:ilvl="8" w:tentative="1">
+      <w:start w:val="1"/>
+      <w:numFmt w:val="bullet"/>
+      <w:lvlText w:val=""/>
+      <w:lvlJc w:val="left"/>
+      <w:pPr>
+        <w:tabs>
+          <w:tab w:val="num" w:pos="6480"/>
+        </w:tabs>
+        <w:ind w:left="6480" w:hanging="360"/>
+      </w:pPr>
+      <w:rPr>
+        <w:rFonts w:ascii="Wingdings" w:hAnsi="Wingdings" w:hint="default"/>
+        <w:sz w:val="20"/>
+      </w:rPr>
+    </w:lvl>
+  </w:abstractNum>
+  <w:abstractNum w:abstractNumId="6" w15:restartNumberingAfterBreak="0">
     <w:nsid w:val="11E70E19"/>
     <w:multiLevelType w:val="multilevel"/>
     <w:tmpl w:val="F8346980"/>
@@ -6018,7 +5861,7 @@
       </w:rPr>
     </w:lvl>
   </w:abstractNum>
-  <w:abstractNum w:abstractNumId="5" w15:restartNumberingAfterBreak="0">
+  <w:abstractNum w:abstractNumId="7" w15:restartNumberingAfterBreak="0">
     <w:nsid w:val="12B97D27"/>
     <w:multiLevelType w:val="multilevel"/>
     <w:tmpl w:val="1BA87D9C"/>
@@ -6167,7 +6010,7 @@
       </w:rPr>
     </w:lvl>
   </w:abstractNum>
-  <w:abstractNum w:abstractNumId="6" w15:restartNumberingAfterBreak="0">
+  <w:abstractNum w:abstractNumId="8" w15:restartNumberingAfterBreak="0">
     <w:nsid w:val="17FF3731"/>
     <w:multiLevelType w:val="multilevel"/>
     <w:tmpl w:val="0F00BCDA"/>
@@ -6280,7 +6123,7 @@
       </w:pPr>
     </w:lvl>
   </w:abstractNum>
-  <w:abstractNum w:abstractNumId="7" w15:restartNumberingAfterBreak="0">
+  <w:abstractNum w:abstractNumId="9" w15:restartNumberingAfterBreak="0">
     <w:nsid w:val="18AA71B4"/>
     <w:multiLevelType w:val="multilevel"/>
     <w:tmpl w:val="8C586CFE"/>
@@ -6429,7 +6272,382 @@
       </w:rPr>
     </w:lvl>
   </w:abstractNum>
-  <w:abstractNum w:abstractNumId="8" w15:restartNumberingAfterBreak="0">
+  <w:abstractNum w:abstractNumId="10" w15:restartNumberingAfterBreak="0">
+    <w:nsid w:val="1A7F2C32"/>
+    <w:multiLevelType w:val="multilevel"/>
+    <w:tmpl w:val="60CE3A26"/>
+    <w:lvl w:ilvl="0">
+      <w:start w:val="1"/>
+      <w:numFmt w:val="decimal"/>
+      <w:lvlText w:val="%1."/>
+      <w:lvlJc w:val="left"/>
+      <w:pPr>
+        <w:tabs>
+          <w:tab w:val="num" w:pos="720"/>
+        </w:tabs>
+        <w:ind w:left="720" w:hanging="360"/>
+      </w:pPr>
+    </w:lvl>
+    <w:lvl w:ilvl="1" w:tentative="1">
+      <w:start w:val="1"/>
+      <w:numFmt w:val="decimal"/>
+      <w:lvlText w:val="%2."/>
+      <w:lvlJc w:val="left"/>
+      <w:pPr>
+        <w:tabs>
+          <w:tab w:val="num" w:pos="1440"/>
+        </w:tabs>
+        <w:ind w:left="1440" w:hanging="360"/>
+      </w:pPr>
+    </w:lvl>
+    <w:lvl w:ilvl="2" w:tentative="1">
+      <w:start w:val="1"/>
+      <w:numFmt w:val="decimal"/>
+      <w:lvlText w:val="%3."/>
+      <w:lvlJc w:val="left"/>
+      <w:pPr>
+        <w:tabs>
+          <w:tab w:val="num" w:pos="2160"/>
+        </w:tabs>
+        <w:ind w:left="2160" w:hanging="360"/>
+      </w:pPr>
+    </w:lvl>
+    <w:lvl w:ilvl="3" w:tentative="1">
+      <w:start w:val="1"/>
+      <w:numFmt w:val="decimal"/>
+      <w:lvlText w:val="%4."/>
+      <w:lvlJc w:val="left"/>
+      <w:pPr>
+        <w:tabs>
+          <w:tab w:val="num" w:pos="2880"/>
+        </w:tabs>
+        <w:ind w:left="2880" w:hanging="360"/>
+      </w:pPr>
+    </w:lvl>
+    <w:lvl w:ilvl="4" w:tentative="1">
+      <w:start w:val="1"/>
+      <w:numFmt w:val="decimal"/>
+      <w:lvlText w:val="%5."/>
+      <w:lvlJc w:val="left"/>
+      <w:pPr>
+        <w:tabs>
+          <w:tab w:val="num" w:pos="3600"/>
+        </w:tabs>
+        <w:ind w:left="3600" w:hanging="360"/>
+      </w:pPr>
+    </w:lvl>
+    <w:lvl w:ilvl="5" w:tentative="1">
+      <w:start w:val="1"/>
+      <w:numFmt w:val="decimal"/>
+      <w:lvlText w:val="%6."/>
+      <w:lvlJc w:val="left"/>
+      <w:pPr>
+        <w:tabs>
+          <w:tab w:val="num" w:pos="4320"/>
+        </w:tabs>
+        <w:ind w:left="4320" w:hanging="360"/>
+      </w:pPr>
+    </w:lvl>
+    <w:lvl w:ilvl="6" w:tentative="1">
+      <w:start w:val="1"/>
+      <w:numFmt w:val="decimal"/>
+      <w:lvlText w:val="%7."/>
+      <w:lvlJc w:val="left"/>
+      <w:pPr>
+        <w:tabs>
+          <w:tab w:val="num" w:pos="5040"/>
+        </w:tabs>
+        <w:ind w:left="5040" w:hanging="360"/>
+      </w:pPr>
+    </w:lvl>
+    <w:lvl w:ilvl="7" w:tentative="1">
+      <w:start w:val="1"/>
+      <w:numFmt w:val="decimal"/>
+      <w:lvlText w:val="%8."/>
+      <w:lvlJc w:val="left"/>
+      <w:pPr>
+        <w:tabs>
+          <w:tab w:val="num" w:pos="5760"/>
+        </w:tabs>
+        <w:ind w:left="5760" w:hanging="360"/>
+      </w:pPr>
+    </w:lvl>
+    <w:lvl w:ilvl="8" w:tentative="1">
+      <w:start w:val="1"/>
+      <w:numFmt w:val="decimal"/>
+      <w:lvlText w:val="%9."/>
+      <w:lvlJc w:val="left"/>
+      <w:pPr>
+        <w:tabs>
+          <w:tab w:val="num" w:pos="6480"/>
+        </w:tabs>
+        <w:ind w:left="6480" w:hanging="360"/>
+      </w:pPr>
+    </w:lvl>
+  </w:abstractNum>
+  <w:abstractNum w:abstractNumId="11" w15:restartNumberingAfterBreak="0">
+    <w:nsid w:val="1C3E355B"/>
+    <w:multiLevelType w:val="multilevel"/>
+    <w:tmpl w:val="21BA5B50"/>
+    <w:lvl w:ilvl="0">
+      <w:start w:val="1"/>
+      <w:numFmt w:val="decimal"/>
+      <w:lvlText w:val="%1."/>
+      <w:lvlJc w:val="left"/>
+      <w:pPr>
+        <w:tabs>
+          <w:tab w:val="num" w:pos="720"/>
+        </w:tabs>
+        <w:ind w:left="720" w:hanging="360"/>
+      </w:pPr>
+    </w:lvl>
+    <w:lvl w:ilvl="1" w:tentative="1">
+      <w:start w:val="1"/>
+      <w:numFmt w:val="decimal"/>
+      <w:lvlText w:val="%2."/>
+      <w:lvlJc w:val="left"/>
+      <w:pPr>
+        <w:tabs>
+          <w:tab w:val="num" w:pos="1440"/>
+        </w:tabs>
+        <w:ind w:left="1440" w:hanging="360"/>
+      </w:pPr>
+    </w:lvl>
+    <w:lvl w:ilvl="2" w:tentative="1">
+      <w:start w:val="1"/>
+      <w:numFmt w:val="decimal"/>
+      <w:lvlText w:val="%3."/>
+      <w:lvlJc w:val="left"/>
+      <w:pPr>
+        <w:tabs>
+          <w:tab w:val="num" w:pos="2160"/>
+        </w:tabs>
+        <w:ind w:left="2160" w:hanging="360"/>
+      </w:pPr>
+    </w:lvl>
+    <w:lvl w:ilvl="3" w:tentative="1">
+      <w:start w:val="1"/>
+      <w:numFmt w:val="decimal"/>
+      <w:lvlText w:val="%4."/>
+      <w:lvlJc w:val="left"/>
+      <w:pPr>
+        <w:tabs>
+          <w:tab w:val="num" w:pos="2880"/>
+        </w:tabs>
+        <w:ind w:left="2880" w:hanging="360"/>
+      </w:pPr>
+    </w:lvl>
+    <w:lvl w:ilvl="4" w:tentative="1">
+      <w:start w:val="1"/>
+      <w:numFmt w:val="decimal"/>
+      <w:lvlText w:val="%5."/>
+      <w:lvlJc w:val="left"/>
+      <w:pPr>
+        <w:tabs>
+          <w:tab w:val="num" w:pos="3600"/>
+        </w:tabs>
+        <w:ind w:left="3600" w:hanging="360"/>
+      </w:pPr>
+    </w:lvl>
+    <w:lvl w:ilvl="5" w:tentative="1">
+      <w:start w:val="1"/>
+      <w:numFmt w:val="decimal"/>
+      <w:lvlText w:val="%6."/>
+      <w:lvlJc w:val="left"/>
+      <w:pPr>
+        <w:tabs>
+          <w:tab w:val="num" w:pos="4320"/>
+        </w:tabs>
+        <w:ind w:left="4320" w:hanging="360"/>
+      </w:pPr>
+    </w:lvl>
+    <w:lvl w:ilvl="6" w:tentative="1">
+      <w:start w:val="1"/>
+      <w:numFmt w:val="decimal"/>
+      <w:lvlText w:val="%7."/>
+      <w:lvlJc w:val="left"/>
+      <w:pPr>
+        <w:tabs>
+          <w:tab w:val="num" w:pos="5040"/>
+        </w:tabs>
+        <w:ind w:left="5040" w:hanging="360"/>
+      </w:pPr>
+    </w:lvl>
+    <w:lvl w:ilvl="7" w:tentative="1">
+      <w:start w:val="1"/>
+      <w:numFmt w:val="decimal"/>
+      <w:lvlText w:val="%8."/>
+      <w:lvlJc w:val="left"/>
+      <w:pPr>
+        <w:tabs>
+          <w:tab w:val="num" w:pos="5760"/>
+        </w:tabs>
+        <w:ind w:left="5760" w:hanging="360"/>
+      </w:pPr>
+    </w:lvl>
+    <w:lvl w:ilvl="8" w:tentative="1">
+      <w:start w:val="1"/>
+      <w:numFmt w:val="decimal"/>
+      <w:lvlText w:val="%9."/>
+      <w:lvlJc w:val="left"/>
+      <w:pPr>
+        <w:tabs>
+          <w:tab w:val="num" w:pos="6480"/>
+        </w:tabs>
+        <w:ind w:left="6480" w:hanging="360"/>
+      </w:pPr>
+    </w:lvl>
+  </w:abstractNum>
+  <w:abstractNum w:abstractNumId="12" w15:restartNumberingAfterBreak="0">
+    <w:nsid w:val="1EA60316"/>
+    <w:multiLevelType w:val="multilevel"/>
+    <w:tmpl w:val="08562724"/>
+    <w:lvl w:ilvl="0">
+      <w:start w:val="1"/>
+      <w:numFmt w:val="bullet"/>
+      <w:lvlText w:val=""/>
+      <w:lvlJc w:val="left"/>
+      <w:pPr>
+        <w:tabs>
+          <w:tab w:val="num" w:pos="720"/>
+        </w:tabs>
+        <w:ind w:left="720" w:hanging="360"/>
+      </w:pPr>
+      <w:rPr>
+        <w:rFonts w:ascii="Symbol" w:hAnsi="Symbol" w:hint="default"/>
+        <w:sz w:val="20"/>
+      </w:rPr>
+    </w:lvl>
+    <w:lvl w:ilvl="1" w:tentative="1">
+      <w:start w:val="1"/>
+      <w:numFmt w:val="bullet"/>
+      <w:lvlText w:val="o"/>
+      <w:lvlJc w:val="left"/>
+      <w:pPr>
+        <w:tabs>
+          <w:tab w:val="num" w:pos="1440"/>
+        </w:tabs>
+        <w:ind w:left="1440" w:hanging="360"/>
+      </w:pPr>
+      <w:rPr>
+        <w:rFonts w:ascii="Courier New" w:hAnsi="Courier New" w:hint="default"/>
+        <w:sz w:val="20"/>
+      </w:rPr>
+    </w:lvl>
+    <w:lvl w:ilvl="2" w:tentative="1">
+      <w:start w:val="1"/>
+      <w:numFmt w:val="bullet"/>
+      <w:lvlText w:val=""/>
+      <w:lvlJc w:val="left"/>
+      <w:pPr>
+        <w:tabs>
+          <w:tab w:val="num" w:pos="2160"/>
+        </w:tabs>
+        <w:ind w:left="2160" w:hanging="360"/>
+      </w:pPr>
+      <w:rPr>
+        <w:rFonts w:ascii="Wingdings" w:hAnsi="Wingdings" w:hint="default"/>
+        <w:sz w:val="20"/>
+      </w:rPr>
+    </w:lvl>
+    <w:lvl w:ilvl="3" w:tentative="1">
+      <w:start w:val="1"/>
+      <w:numFmt w:val="bullet"/>
+      <w:lvlText w:val=""/>
+      <w:lvlJc w:val="left"/>
+      <w:pPr>
+        <w:tabs>
+          <w:tab w:val="num" w:pos="2880"/>
+        </w:tabs>
+        <w:ind w:left="2880" w:hanging="360"/>
+      </w:pPr>
+      <w:rPr>
+        <w:rFonts w:ascii="Wingdings" w:hAnsi="Wingdings" w:hint="default"/>
+        <w:sz w:val="20"/>
+      </w:rPr>
+    </w:lvl>
+    <w:lvl w:ilvl="4" w:tentative="1">
+      <w:start w:val="1"/>
+      <w:numFmt w:val="bullet"/>
+      <w:lvlText w:val=""/>
+      <w:lvlJc w:val="left"/>
+      <w:pPr>
+        <w:tabs>
+          <w:tab w:val="num" w:pos="3600"/>
+        </w:tabs>
+        <w:ind w:left="3600" w:hanging="360"/>
+      </w:pPr>
+      <w:rPr>
+        <w:rFonts w:ascii="Wingdings" w:hAnsi="Wingdings" w:hint="default"/>
+        <w:sz w:val="20"/>
+      </w:rPr>
+    </w:lvl>
+    <w:lvl w:ilvl="5" w:tentative="1">
+      <w:start w:val="1"/>
+      <w:numFmt w:val="bullet"/>
+      <w:lvlText w:val=""/>
+      <w:lvlJc w:val="left"/>
+      <w:pPr>
+        <w:tabs>
+          <w:tab w:val="num" w:pos="4320"/>
+        </w:tabs>
+        <w:ind w:left="4320" w:hanging="360"/>
+      </w:pPr>
+      <w:rPr>
+        <w:rFonts w:ascii="Wingdings" w:hAnsi="Wingdings" w:hint="default"/>
+        <w:sz w:val="20"/>
+      </w:rPr>
+    </w:lvl>
+    <w:lvl w:ilvl="6" w:tentative="1">
+      <w:start w:val="1"/>
+      <w:numFmt w:val="bullet"/>
+      <w:lvlText w:val=""/>
+      <w:lvlJc w:val="left"/>
+      <w:pPr>
+        <w:tabs>
+          <w:tab w:val="num" w:pos="5040"/>
+        </w:tabs>
+        <w:ind w:left="5040" w:hanging="360"/>
+      </w:pPr>
+      <w:rPr>
+        <w:rFonts w:ascii="Wingdings" w:hAnsi="Wingdings" w:hint="default"/>
+        <w:sz w:val="20"/>
+      </w:rPr>
+    </w:lvl>
+    <w:lvl w:ilvl="7" w:tentative="1">
+      <w:start w:val="1"/>
+      <w:numFmt w:val="bullet"/>
+      <w:lvlText w:val=""/>
+      <w:lvlJc w:val="left"/>
+      <w:pPr>
+        <w:tabs>
+          <w:tab w:val="num" w:pos="5760"/>
+        </w:tabs>
+        <w:ind w:left="5760" w:hanging="360"/>
+      </w:pPr>
+      <w:rPr>
+        <w:rFonts w:ascii="Wingdings" w:hAnsi="Wingdings" w:hint="default"/>
+        <w:sz w:val="20"/>
+      </w:rPr>
+    </w:lvl>
+    <w:lvl w:ilvl="8" w:tentative="1">
+      <w:start w:val="1"/>
+      <w:numFmt w:val="bullet"/>
+      <w:lvlText w:val=""/>
+      <w:lvlJc w:val="left"/>
+      <w:pPr>
+        <w:tabs>
+          <w:tab w:val="num" w:pos="6480"/>
+        </w:tabs>
+        <w:ind w:left="6480" w:hanging="360"/>
+      </w:pPr>
+      <w:rPr>
+        <w:rFonts w:ascii="Wingdings" w:hAnsi="Wingdings" w:hint="default"/>
+        <w:sz w:val="20"/>
+      </w:rPr>
+    </w:lvl>
+  </w:abstractNum>
+  <w:abstractNum w:abstractNumId="13" w15:restartNumberingAfterBreak="0">
     <w:nsid w:val="22683997"/>
     <w:multiLevelType w:val="multilevel"/>
     <w:tmpl w:val="0936AAB2"/>
@@ -6542,7 +6760,305 @@
       </w:pPr>
     </w:lvl>
   </w:abstractNum>
-  <w:abstractNum w:abstractNumId="9" w15:restartNumberingAfterBreak="0">
+  <w:abstractNum w:abstractNumId="14" w15:restartNumberingAfterBreak="0">
+    <w:nsid w:val="23164499"/>
+    <w:multiLevelType w:val="multilevel"/>
+    <w:tmpl w:val="D20E05DE"/>
+    <w:lvl w:ilvl="0">
+      <w:start w:val="1"/>
+      <w:numFmt w:val="bullet"/>
+      <w:lvlText w:val=""/>
+      <w:lvlJc w:val="left"/>
+      <w:pPr>
+        <w:tabs>
+          <w:tab w:val="num" w:pos="720"/>
+        </w:tabs>
+        <w:ind w:left="720" w:hanging="360"/>
+      </w:pPr>
+      <w:rPr>
+        <w:rFonts w:ascii="Symbol" w:hAnsi="Symbol" w:hint="default"/>
+        <w:sz w:val="20"/>
+      </w:rPr>
+    </w:lvl>
+    <w:lvl w:ilvl="1" w:tentative="1">
+      <w:start w:val="1"/>
+      <w:numFmt w:val="bullet"/>
+      <w:lvlText w:val="o"/>
+      <w:lvlJc w:val="left"/>
+      <w:pPr>
+        <w:tabs>
+          <w:tab w:val="num" w:pos="1440"/>
+        </w:tabs>
+        <w:ind w:left="1440" w:hanging="360"/>
+      </w:pPr>
+      <w:rPr>
+        <w:rFonts w:ascii="Courier New" w:hAnsi="Courier New" w:hint="default"/>
+        <w:sz w:val="20"/>
+      </w:rPr>
+    </w:lvl>
+    <w:lvl w:ilvl="2" w:tentative="1">
+      <w:start w:val="1"/>
+      <w:numFmt w:val="bullet"/>
+      <w:lvlText w:val=""/>
+      <w:lvlJc w:val="left"/>
+      <w:pPr>
+        <w:tabs>
+          <w:tab w:val="num" w:pos="2160"/>
+        </w:tabs>
+        <w:ind w:left="2160" w:hanging="360"/>
+      </w:pPr>
+      <w:rPr>
+        <w:rFonts w:ascii="Wingdings" w:hAnsi="Wingdings" w:hint="default"/>
+        <w:sz w:val="20"/>
+      </w:rPr>
+    </w:lvl>
+    <w:lvl w:ilvl="3" w:tentative="1">
+      <w:start w:val="1"/>
+      <w:numFmt w:val="bullet"/>
+      <w:lvlText w:val=""/>
+      <w:lvlJc w:val="left"/>
+      <w:pPr>
+        <w:tabs>
+          <w:tab w:val="num" w:pos="2880"/>
+        </w:tabs>
+        <w:ind w:left="2880" w:hanging="360"/>
+      </w:pPr>
+      <w:rPr>
+        <w:rFonts w:ascii="Wingdings" w:hAnsi="Wingdings" w:hint="default"/>
+        <w:sz w:val="20"/>
+      </w:rPr>
+    </w:lvl>
+    <w:lvl w:ilvl="4" w:tentative="1">
+      <w:start w:val="1"/>
+      <w:numFmt w:val="bullet"/>
+      <w:lvlText w:val=""/>
+      <w:lvlJc w:val="left"/>
+      <w:pPr>
+        <w:tabs>
+          <w:tab w:val="num" w:pos="3600"/>
+        </w:tabs>
+        <w:ind w:left="3600" w:hanging="360"/>
+      </w:pPr>
+      <w:rPr>
+        <w:rFonts w:ascii="Wingdings" w:hAnsi="Wingdings" w:hint="default"/>
+        <w:sz w:val="20"/>
+      </w:rPr>
+    </w:lvl>
+    <w:lvl w:ilvl="5" w:tentative="1">
+      <w:start w:val="1"/>
+      <w:numFmt w:val="bullet"/>
+      <w:lvlText w:val=""/>
+      <w:lvlJc w:val="left"/>
+      <w:pPr>
+        <w:tabs>
+          <w:tab w:val="num" w:pos="4320"/>
+        </w:tabs>
+        <w:ind w:left="4320" w:hanging="360"/>
+      </w:pPr>
+      <w:rPr>
+        <w:rFonts w:ascii="Wingdings" w:hAnsi="Wingdings" w:hint="default"/>
+        <w:sz w:val="20"/>
+      </w:rPr>
+    </w:lvl>
+    <w:lvl w:ilvl="6" w:tentative="1">
+      <w:start w:val="1"/>
+      <w:numFmt w:val="bullet"/>
+      <w:lvlText w:val=""/>
+      <w:lvlJc w:val="left"/>
+      <w:pPr>
+        <w:tabs>
+          <w:tab w:val="num" w:pos="5040"/>
+        </w:tabs>
+        <w:ind w:left="5040" w:hanging="360"/>
+      </w:pPr>
+      <w:rPr>
+        <w:rFonts w:ascii="Wingdings" w:hAnsi="Wingdings" w:hint="default"/>
+        <w:sz w:val="20"/>
+      </w:rPr>
+    </w:lvl>
+    <w:lvl w:ilvl="7" w:tentative="1">
+      <w:start w:val="1"/>
+      <w:numFmt w:val="bullet"/>
+      <w:lvlText w:val=""/>
+      <w:lvlJc w:val="left"/>
+      <w:pPr>
+        <w:tabs>
+          <w:tab w:val="num" w:pos="5760"/>
+        </w:tabs>
+        <w:ind w:left="5760" w:hanging="360"/>
+      </w:pPr>
+      <w:rPr>
+        <w:rFonts w:ascii="Wingdings" w:hAnsi="Wingdings" w:hint="default"/>
+        <w:sz w:val="20"/>
+      </w:rPr>
+    </w:lvl>
+    <w:lvl w:ilvl="8" w:tentative="1">
+      <w:start w:val="1"/>
+      <w:numFmt w:val="bullet"/>
+      <w:lvlText w:val=""/>
+      <w:lvlJc w:val="left"/>
+      <w:pPr>
+        <w:tabs>
+          <w:tab w:val="num" w:pos="6480"/>
+        </w:tabs>
+        <w:ind w:left="6480" w:hanging="360"/>
+      </w:pPr>
+      <w:rPr>
+        <w:rFonts w:ascii="Wingdings" w:hAnsi="Wingdings" w:hint="default"/>
+        <w:sz w:val="20"/>
+      </w:rPr>
+    </w:lvl>
+  </w:abstractNum>
+  <w:abstractNum w:abstractNumId="15" w15:restartNumberingAfterBreak="0">
+    <w:nsid w:val="2B911834"/>
+    <w:multiLevelType w:val="multilevel"/>
+    <w:tmpl w:val="7560467A"/>
+    <w:lvl w:ilvl="0">
+      <w:start w:val="1"/>
+      <w:numFmt w:val="bullet"/>
+      <w:lvlText w:val=""/>
+      <w:lvlJc w:val="left"/>
+      <w:pPr>
+        <w:tabs>
+          <w:tab w:val="num" w:pos="720"/>
+        </w:tabs>
+        <w:ind w:left="720" w:hanging="360"/>
+      </w:pPr>
+      <w:rPr>
+        <w:rFonts w:ascii="Symbol" w:hAnsi="Symbol" w:hint="default"/>
+        <w:sz w:val="20"/>
+      </w:rPr>
+    </w:lvl>
+    <w:lvl w:ilvl="1" w:tentative="1">
+      <w:start w:val="1"/>
+      <w:numFmt w:val="bullet"/>
+      <w:lvlText w:val="o"/>
+      <w:lvlJc w:val="left"/>
+      <w:pPr>
+        <w:tabs>
+          <w:tab w:val="num" w:pos="1440"/>
+        </w:tabs>
+        <w:ind w:left="1440" w:hanging="360"/>
+      </w:pPr>
+      <w:rPr>
+        <w:rFonts w:ascii="Courier New" w:hAnsi="Courier New" w:hint="default"/>
+        <w:sz w:val="20"/>
+      </w:rPr>
+    </w:lvl>
+    <w:lvl w:ilvl="2" w:tentative="1">
+      <w:start w:val="1"/>
+      <w:numFmt w:val="bullet"/>
+      <w:lvlText w:val=""/>
+      <w:lvlJc w:val="left"/>
+      <w:pPr>
+        <w:tabs>
+          <w:tab w:val="num" w:pos="2160"/>
+        </w:tabs>
+        <w:ind w:left="2160" w:hanging="360"/>
+      </w:pPr>
+      <w:rPr>
+        <w:rFonts w:ascii="Wingdings" w:hAnsi="Wingdings" w:hint="default"/>
+        <w:sz w:val="20"/>
+      </w:rPr>
+    </w:lvl>
+    <w:lvl w:ilvl="3" w:tentative="1">
+      <w:start w:val="1"/>
+      <w:numFmt w:val="bullet"/>
+      <w:lvlText w:val=""/>
+      <w:lvlJc w:val="left"/>
+      <w:pPr>
+        <w:tabs>
+          <w:tab w:val="num" w:pos="2880"/>
+        </w:tabs>
+        <w:ind w:left="2880" w:hanging="360"/>
+      </w:pPr>
+      <w:rPr>
+        <w:rFonts w:ascii="Wingdings" w:hAnsi="Wingdings" w:hint="default"/>
+        <w:sz w:val="20"/>
+      </w:rPr>
+    </w:lvl>
+    <w:lvl w:ilvl="4" w:tentative="1">
+      <w:start w:val="1"/>
+      <w:numFmt w:val="bullet"/>
+      <w:lvlText w:val=""/>
+      <w:lvlJc w:val="left"/>
+      <w:pPr>
+        <w:tabs>
+          <w:tab w:val="num" w:pos="3600"/>
+        </w:tabs>
+        <w:ind w:left="3600" w:hanging="360"/>
+      </w:pPr>
+      <w:rPr>
+        <w:rFonts w:ascii="Wingdings" w:hAnsi="Wingdings" w:hint="default"/>
+        <w:sz w:val="20"/>
+      </w:rPr>
+    </w:lvl>
+    <w:lvl w:ilvl="5" w:tentative="1">
+      <w:start w:val="1"/>
+      <w:numFmt w:val="bullet"/>
+      <w:lvlText w:val=""/>
+      <w:lvlJc w:val="left"/>
+      <w:pPr>
+        <w:tabs>
+          <w:tab w:val="num" w:pos="4320"/>
+        </w:tabs>
+        <w:ind w:left="4320" w:hanging="360"/>
+      </w:pPr>
+      <w:rPr>
+        <w:rFonts w:ascii="Wingdings" w:hAnsi="Wingdings" w:hint="default"/>
+        <w:sz w:val="20"/>
+      </w:rPr>
+    </w:lvl>
+    <w:lvl w:ilvl="6" w:tentative="1">
+      <w:start w:val="1"/>
+      <w:numFmt w:val="bullet"/>
+      <w:lvlText w:val=""/>
+      <w:lvlJc w:val="left"/>
+      <w:pPr>
+        <w:tabs>
+          <w:tab w:val="num" w:pos="5040"/>
+        </w:tabs>
+        <w:ind w:left="5040" w:hanging="360"/>
+      </w:pPr>
+      <w:rPr>
+        <w:rFonts w:ascii="Wingdings" w:hAnsi="Wingdings" w:hint="default"/>
+        <w:sz w:val="20"/>
+      </w:rPr>
+    </w:lvl>
+    <w:lvl w:ilvl="7" w:tentative="1">
+      <w:start w:val="1"/>
+      <w:numFmt w:val="bullet"/>
+      <w:lvlText w:val=""/>
+      <w:lvlJc w:val="left"/>
+      <w:pPr>
+        <w:tabs>
+          <w:tab w:val="num" w:pos="5760"/>
+        </w:tabs>
+        <w:ind w:left="5760" w:hanging="360"/>
+      </w:pPr>
+      <w:rPr>
+        <w:rFonts w:ascii="Wingdings" w:hAnsi="Wingdings" w:hint="default"/>
+        <w:sz w:val="20"/>
+      </w:rPr>
+    </w:lvl>
+    <w:lvl w:ilvl="8" w:tentative="1">
+      <w:start w:val="1"/>
+      <w:numFmt w:val="bullet"/>
+      <w:lvlText w:val=""/>
+      <w:lvlJc w:val="left"/>
+      <w:pPr>
+        <w:tabs>
+          <w:tab w:val="num" w:pos="6480"/>
+        </w:tabs>
+        <w:ind w:left="6480" w:hanging="360"/>
+      </w:pPr>
+      <w:rPr>
+        <w:rFonts w:ascii="Wingdings" w:hAnsi="Wingdings" w:hint="default"/>
+        <w:sz w:val="20"/>
+      </w:rPr>
+    </w:lvl>
+  </w:abstractNum>
+  <w:abstractNum w:abstractNumId="16" w15:restartNumberingAfterBreak="0">
     <w:nsid w:val="330A37CE"/>
     <w:multiLevelType w:val="multilevel"/>
     <w:tmpl w:val="42506B46"/>
@@ -6655,7 +7171,7 @@
       </w:pPr>
     </w:lvl>
   </w:abstractNum>
-  <w:abstractNum w:abstractNumId="10" w15:restartNumberingAfterBreak="0">
+  <w:abstractNum w:abstractNumId="17" w15:restartNumberingAfterBreak="0">
     <w:nsid w:val="397D1DD7"/>
     <w:multiLevelType w:val="multilevel"/>
     <w:tmpl w:val="05B2DF08"/>
@@ -6768,7 +7284,7 @@
       </w:pPr>
     </w:lvl>
   </w:abstractNum>
-  <w:abstractNum w:abstractNumId="11" w15:restartNumberingAfterBreak="0">
+  <w:abstractNum w:abstractNumId="18" w15:restartNumberingAfterBreak="0">
     <w:nsid w:val="3BDA5125"/>
     <w:multiLevelType w:val="multilevel"/>
     <w:tmpl w:val="681A2D88"/>
@@ -6885,7 +7401,7 @@
       </w:pPr>
     </w:lvl>
   </w:abstractNum>
-  <w:abstractNum w:abstractNumId="12" w15:restartNumberingAfterBreak="0">
+  <w:abstractNum w:abstractNumId="19" w15:restartNumberingAfterBreak="0">
     <w:nsid w:val="40426A37"/>
     <w:multiLevelType w:val="multilevel"/>
     <w:tmpl w:val="07ACB19A"/>
@@ -7002,7 +7518,120 @@
       </w:pPr>
     </w:lvl>
   </w:abstractNum>
-  <w:abstractNum w:abstractNumId="13" w15:restartNumberingAfterBreak="0">
+  <w:abstractNum w:abstractNumId="20" w15:restartNumberingAfterBreak="0">
+    <w:nsid w:val="4F4D072A"/>
+    <w:multiLevelType w:val="multilevel"/>
+    <w:tmpl w:val="ED603CC6"/>
+    <w:lvl w:ilvl="0">
+      <w:start w:val="1"/>
+      <w:numFmt w:val="decimal"/>
+      <w:lvlText w:val="%1."/>
+      <w:lvlJc w:val="left"/>
+      <w:pPr>
+        <w:tabs>
+          <w:tab w:val="num" w:pos="720"/>
+        </w:tabs>
+        <w:ind w:left="720" w:hanging="360"/>
+      </w:pPr>
+    </w:lvl>
+    <w:lvl w:ilvl="1" w:tentative="1">
+      <w:start w:val="1"/>
+      <w:numFmt w:val="decimal"/>
+      <w:lvlText w:val="%2."/>
+      <w:lvlJc w:val="left"/>
+      <w:pPr>
+        <w:tabs>
+          <w:tab w:val="num" w:pos="1440"/>
+        </w:tabs>
+        <w:ind w:left="1440" w:hanging="360"/>
+      </w:pPr>
+    </w:lvl>
+    <w:lvl w:ilvl="2" w:tentative="1">
+      <w:start w:val="1"/>
+      <w:numFmt w:val="decimal"/>
+      <w:lvlText w:val="%3."/>
+      <w:lvlJc w:val="left"/>
+      <w:pPr>
+        <w:tabs>
+          <w:tab w:val="num" w:pos="2160"/>
+        </w:tabs>
+        <w:ind w:left="2160" w:hanging="360"/>
+      </w:pPr>
+    </w:lvl>
+    <w:lvl w:ilvl="3" w:tentative="1">
+      <w:start w:val="1"/>
+      <w:numFmt w:val="decimal"/>
+      <w:lvlText w:val="%4."/>
+      <w:lvlJc w:val="left"/>
+      <w:pPr>
+        <w:tabs>
+          <w:tab w:val="num" w:pos="2880"/>
+        </w:tabs>
+        <w:ind w:left="2880" w:hanging="360"/>
+      </w:pPr>
+    </w:lvl>
+    <w:lvl w:ilvl="4" w:tentative="1">
+      <w:start w:val="1"/>
+      <w:numFmt w:val="decimal"/>
+      <w:lvlText w:val="%5."/>
+      <w:lvlJc w:val="left"/>
+      <w:pPr>
+        <w:tabs>
+          <w:tab w:val="num" w:pos="3600"/>
+        </w:tabs>
+        <w:ind w:left="3600" w:hanging="360"/>
+      </w:pPr>
+    </w:lvl>
+    <w:lvl w:ilvl="5" w:tentative="1">
+      <w:start w:val="1"/>
+      <w:numFmt w:val="decimal"/>
+      <w:lvlText w:val="%6."/>
+      <w:lvlJc w:val="left"/>
+      <w:pPr>
+        <w:tabs>
+          <w:tab w:val="num" w:pos="4320"/>
+        </w:tabs>
+        <w:ind w:left="4320" w:hanging="360"/>
+      </w:pPr>
+    </w:lvl>
+    <w:lvl w:ilvl="6" w:tentative="1">
+      <w:start w:val="1"/>
+      <w:numFmt w:val="decimal"/>
+      <w:lvlText w:val="%7."/>
+      <w:lvlJc w:val="left"/>
+      <w:pPr>
+        <w:tabs>
+          <w:tab w:val="num" w:pos="5040"/>
+        </w:tabs>
+        <w:ind w:left="5040" w:hanging="360"/>
+      </w:pPr>
+    </w:lvl>
+    <w:lvl w:ilvl="7" w:tentative="1">
+      <w:start w:val="1"/>
+      <w:numFmt w:val="decimal"/>
+      <w:lvlText w:val="%8."/>
+      <w:lvlJc w:val="left"/>
+      <w:pPr>
+        <w:tabs>
+          <w:tab w:val="num" w:pos="5760"/>
+        </w:tabs>
+        <w:ind w:left="5760" w:hanging="360"/>
+      </w:pPr>
+    </w:lvl>
+    <w:lvl w:ilvl="8" w:tentative="1">
+      <w:start w:val="1"/>
+      <w:numFmt w:val="decimal"/>
+      <w:lvlText w:val="%9."/>
+      <w:lvlJc w:val="left"/>
+      <w:pPr>
+        <w:tabs>
+          <w:tab w:val="num" w:pos="6480"/>
+        </w:tabs>
+        <w:ind w:left="6480" w:hanging="360"/>
+      </w:pPr>
+    </w:lvl>
+  </w:abstractNum>
+  <w:abstractNum w:abstractNumId="21" w15:restartNumberingAfterBreak="0">
     <w:nsid w:val="5A874391"/>
     <w:multiLevelType w:val="multilevel"/>
     <w:tmpl w:val="9F0640A4"/>
@@ -7151,7 +7780,7 @@
       </w:rPr>
     </w:lvl>
   </w:abstractNum>
-  <w:abstractNum w:abstractNumId="14" w15:restartNumberingAfterBreak="0">
+  <w:abstractNum w:abstractNumId="22" w15:restartNumberingAfterBreak="0">
     <w:nsid w:val="6163572F"/>
     <w:multiLevelType w:val="multilevel"/>
     <w:tmpl w:val="CAD6FD7C"/>
@@ -7300,7 +7929,7 @@
       </w:rPr>
     </w:lvl>
   </w:abstractNum>
-  <w:abstractNum w:abstractNumId="15" w15:restartNumberingAfterBreak="0">
+  <w:abstractNum w:abstractNumId="23" w15:restartNumberingAfterBreak="0">
     <w:nsid w:val="61A662AA"/>
     <w:multiLevelType w:val="multilevel"/>
     <w:tmpl w:val="A4500206"/>
@@ -7449,7 +8078,7 @@
       </w:rPr>
     </w:lvl>
   </w:abstractNum>
-  <w:abstractNum w:abstractNumId="16" w15:restartNumberingAfterBreak="0">
+  <w:abstractNum w:abstractNumId="24" w15:restartNumberingAfterBreak="0">
     <w:nsid w:val="624F4F0B"/>
     <w:multiLevelType w:val="multilevel"/>
     <w:tmpl w:val="2152AB3C"/>
@@ -7598,7 +8227,124 @@
       </w:rPr>
     </w:lvl>
   </w:abstractNum>
-  <w:abstractNum w:abstractNumId="17" w15:restartNumberingAfterBreak="0">
+  <w:abstractNum w:abstractNumId="25" w15:restartNumberingAfterBreak="0">
+    <w:nsid w:val="723A75BB"/>
+    <w:multiLevelType w:val="multilevel"/>
+    <w:tmpl w:val="BC36DB6E"/>
+    <w:lvl w:ilvl="0">
+      <w:start w:val="1"/>
+      <w:numFmt w:val="decimal"/>
+      <w:lvlText w:val="%1."/>
+      <w:lvlJc w:val="left"/>
+      <w:pPr>
+        <w:tabs>
+          <w:tab w:val="num" w:pos="720"/>
+        </w:tabs>
+        <w:ind w:left="720" w:hanging="360"/>
+      </w:pPr>
+    </w:lvl>
+    <w:lvl w:ilvl="1">
+      <w:start w:val="1"/>
+      <w:numFmt w:val="bullet"/>
+      <w:lvlText w:val="o"/>
+      <w:lvlJc w:val="left"/>
+      <w:pPr>
+        <w:tabs>
+          <w:tab w:val="num" w:pos="1440"/>
+        </w:tabs>
+        <w:ind w:left="1440" w:hanging="360"/>
+      </w:pPr>
+      <w:rPr>
+        <w:rFonts w:ascii="Courier New" w:hAnsi="Courier New" w:hint="default"/>
+        <w:sz w:val="20"/>
+      </w:rPr>
+    </w:lvl>
+    <w:lvl w:ilvl="2" w:tentative="1">
+      <w:start w:val="1"/>
+      <w:numFmt w:val="decimal"/>
+      <w:lvlText w:val="%3."/>
+      <w:lvlJc w:val="left"/>
+      <w:pPr>
+        <w:tabs>
+          <w:tab w:val="num" w:pos="2160"/>
+        </w:tabs>
+        <w:ind w:left="2160" w:hanging="360"/>
+      </w:pPr>
+    </w:lvl>
+    <w:lvl w:ilvl="3" w:tentative="1">
+      <w:start w:val="1"/>
+      <w:numFmt w:val="decimal"/>
+      <w:lvlText w:val="%4."/>
+      <w:lvlJc w:val="left"/>
+      <w:pPr>
+        <w:tabs>
+          <w:tab w:val="num" w:pos="2880"/>
+        </w:tabs>
+        <w:ind w:left="2880" w:hanging="360"/>
+      </w:pPr>
+    </w:lvl>
+    <w:lvl w:ilvl="4" w:tentative="1">
+      <w:start w:val="1"/>
+      <w:numFmt w:val="decimal"/>
+      <w:lvlText w:val="%5."/>
+      <w:lvlJc w:val="left"/>
+      <w:pPr>
+        <w:tabs>
+          <w:tab w:val="num" w:pos="3600"/>
+        </w:tabs>
+        <w:ind w:left="3600" w:hanging="360"/>
+      </w:pPr>
+    </w:lvl>
+    <w:lvl w:ilvl="5" w:tentative="1">
+      <w:start w:val="1"/>
+      <w:numFmt w:val="decimal"/>
+      <w:lvlText w:val="%6."/>
+      <w:lvlJc w:val="left"/>
+      <w:pPr>
+        <w:tabs>
+          <w:tab w:val="num" w:pos="4320"/>
+        </w:tabs>
+        <w:ind w:left="4320" w:hanging="360"/>
+      </w:pPr>
+    </w:lvl>
+    <w:lvl w:ilvl="6" w:tentative="1">
+      <w:start w:val="1"/>
+      <w:numFmt w:val="decimal"/>
+      <w:lvlText w:val="%7."/>
+      <w:lvlJc w:val="left"/>
+      <w:pPr>
+        <w:tabs>
+          <w:tab w:val="num" w:pos="5040"/>
+        </w:tabs>
+        <w:ind w:left="5040" w:hanging="360"/>
+      </w:pPr>
+    </w:lvl>
+    <w:lvl w:ilvl="7" w:tentative="1">
+      <w:start w:val="1"/>
+      <w:numFmt w:val="decimal"/>
+      <w:lvlText w:val="%8."/>
+      <w:lvlJc w:val="left"/>
+      <w:pPr>
+        <w:tabs>
+          <w:tab w:val="num" w:pos="5760"/>
+        </w:tabs>
+        <w:ind w:left="5760" w:hanging="360"/>
+      </w:pPr>
+    </w:lvl>
+    <w:lvl w:ilvl="8" w:tentative="1">
+      <w:start w:val="1"/>
+      <w:numFmt w:val="decimal"/>
+      <w:lvlText w:val="%9."/>
+      <w:lvlJc w:val="left"/>
+      <w:pPr>
+        <w:tabs>
+          <w:tab w:val="num" w:pos="6480"/>
+        </w:tabs>
+        <w:ind w:left="6480" w:hanging="360"/>
+      </w:pPr>
+    </w:lvl>
+  </w:abstractNum>
+  <w:abstractNum w:abstractNumId="26" w15:restartNumberingAfterBreak="0">
     <w:nsid w:val="72DE78A4"/>
     <w:multiLevelType w:val="multilevel"/>
     <w:tmpl w:val="F1A87218"/>
@@ -7747,7 +8493,7 @@
       </w:rPr>
     </w:lvl>
   </w:abstractNum>
-  <w:abstractNum w:abstractNumId="18" w15:restartNumberingAfterBreak="0">
+  <w:abstractNum w:abstractNumId="27" w15:restartNumberingAfterBreak="0">
     <w:nsid w:val="73FF5CE8"/>
     <w:multiLevelType w:val="multilevel"/>
     <w:tmpl w:val="DDDE3ECA"/>
@@ -7896,7 +8642,156 @@
       </w:rPr>
     </w:lvl>
   </w:abstractNum>
-  <w:abstractNum w:abstractNumId="19" w15:restartNumberingAfterBreak="0">
+  <w:abstractNum w:abstractNumId="28" w15:restartNumberingAfterBreak="0">
+    <w:nsid w:val="7A462AAA"/>
+    <w:multiLevelType w:val="multilevel"/>
+    <w:tmpl w:val="F3E89DA8"/>
+    <w:lvl w:ilvl="0">
+      <w:start w:val="1"/>
+      <w:numFmt w:val="bullet"/>
+      <w:lvlText w:val=""/>
+      <w:lvlJc w:val="left"/>
+      <w:pPr>
+        <w:tabs>
+          <w:tab w:val="num" w:pos="720"/>
+        </w:tabs>
+        <w:ind w:left="720" w:hanging="360"/>
+      </w:pPr>
+      <w:rPr>
+        <w:rFonts w:ascii="Symbol" w:hAnsi="Symbol" w:hint="default"/>
+        <w:sz w:val="20"/>
+      </w:rPr>
+    </w:lvl>
+    <w:lvl w:ilvl="1" w:tentative="1">
+      <w:start w:val="1"/>
+      <w:numFmt w:val="bullet"/>
+      <w:lvlText w:val="o"/>
+      <w:lvlJc w:val="left"/>
+      <w:pPr>
+        <w:tabs>
+          <w:tab w:val="num" w:pos="1440"/>
+        </w:tabs>
+        <w:ind w:left="1440" w:hanging="360"/>
+      </w:pPr>
+      <w:rPr>
+        <w:rFonts w:ascii="Courier New" w:hAnsi="Courier New" w:hint="default"/>
+        <w:sz w:val="20"/>
+      </w:rPr>
+    </w:lvl>
+    <w:lvl w:ilvl="2" w:tentative="1">
+      <w:start w:val="1"/>
+      <w:numFmt w:val="bullet"/>
+      <w:lvlText w:val=""/>
+      <w:lvlJc w:val="left"/>
+      <w:pPr>
+        <w:tabs>
+          <w:tab w:val="num" w:pos="2160"/>
+        </w:tabs>
+        <w:ind w:left="2160" w:hanging="360"/>
+      </w:pPr>
+      <w:rPr>
+        <w:rFonts w:ascii="Wingdings" w:hAnsi="Wingdings" w:hint="default"/>
+        <w:sz w:val="20"/>
+      </w:rPr>
+    </w:lvl>
+    <w:lvl w:ilvl="3" w:tentative="1">
+      <w:start w:val="1"/>
+      <w:numFmt w:val="bullet"/>
+      <w:lvlText w:val=""/>
+      <w:lvlJc w:val="left"/>
+      <w:pPr>
+        <w:tabs>
+          <w:tab w:val="num" w:pos="2880"/>
+        </w:tabs>
+        <w:ind w:left="2880" w:hanging="360"/>
+      </w:pPr>
+      <w:rPr>
+        <w:rFonts w:ascii="Wingdings" w:hAnsi="Wingdings" w:hint="default"/>
+        <w:sz w:val="20"/>
+      </w:rPr>
+    </w:lvl>
+    <w:lvl w:ilvl="4" w:tentative="1">
+      <w:start w:val="1"/>
+      <w:numFmt w:val="bullet"/>
+      <w:lvlText w:val=""/>
+      <w:lvlJc w:val="left"/>
+      <w:pPr>
+        <w:tabs>
+          <w:tab w:val="num" w:pos="3600"/>
+        </w:tabs>
+        <w:ind w:left="3600" w:hanging="360"/>
+      </w:pPr>
+      <w:rPr>
+        <w:rFonts w:ascii="Wingdings" w:hAnsi="Wingdings" w:hint="default"/>
+        <w:sz w:val="20"/>
+      </w:rPr>
+    </w:lvl>
+    <w:lvl w:ilvl="5" w:tentative="1">
+      <w:start w:val="1"/>
+      <w:numFmt w:val="bullet"/>
+      <w:lvlText w:val=""/>
+      <w:lvlJc w:val="left"/>
+      <w:pPr>
+        <w:tabs>
+          <w:tab w:val="num" w:pos="4320"/>
+        </w:tabs>
+        <w:ind w:left="4320" w:hanging="360"/>
+      </w:pPr>
+      <w:rPr>
+        <w:rFonts w:ascii="Wingdings" w:hAnsi="Wingdings" w:hint="default"/>
+        <w:sz w:val="20"/>
+      </w:rPr>
+    </w:lvl>
+    <w:lvl w:ilvl="6" w:tentative="1">
+      <w:start w:val="1"/>
+      <w:numFmt w:val="bullet"/>
+      <w:lvlText w:val=""/>
+      <w:lvlJc w:val="left"/>
+      <w:pPr>
+        <w:tabs>
+          <w:tab w:val="num" w:pos="5040"/>
+        </w:tabs>
+        <w:ind w:left="5040" w:hanging="360"/>
+      </w:pPr>
+      <w:rPr>
+        <w:rFonts w:ascii="Wingdings" w:hAnsi="Wingdings" w:hint="default"/>
+        <w:sz w:val="20"/>
+      </w:rPr>
+    </w:lvl>
+    <w:lvl w:ilvl="7" w:tentative="1">
+      <w:start w:val="1"/>
+      <w:numFmt w:val="bullet"/>
+      <w:lvlText w:val=""/>
+      <w:lvlJc w:val="left"/>
+      <w:pPr>
+        <w:tabs>
+          <w:tab w:val="num" w:pos="5760"/>
+        </w:tabs>
+        <w:ind w:left="5760" w:hanging="360"/>
+      </w:pPr>
+      <w:rPr>
+        <w:rFonts w:ascii="Wingdings" w:hAnsi="Wingdings" w:hint="default"/>
+        <w:sz w:val="20"/>
+      </w:rPr>
+    </w:lvl>
+    <w:lvl w:ilvl="8" w:tentative="1">
+      <w:start w:val="1"/>
+      <w:numFmt w:val="bullet"/>
+      <w:lvlText w:val=""/>
+      <w:lvlJc w:val="left"/>
+      <w:pPr>
+        <w:tabs>
+          <w:tab w:val="num" w:pos="6480"/>
+        </w:tabs>
+        <w:ind w:left="6480" w:hanging="360"/>
+      </w:pPr>
+      <w:rPr>
+        <w:rFonts w:ascii="Wingdings" w:hAnsi="Wingdings" w:hint="default"/>
+        <w:sz w:val="20"/>
+      </w:rPr>
+    </w:lvl>
+  </w:abstractNum>
+  <w:abstractNum w:abstractNumId="29" w15:restartNumberingAfterBreak="0">
     <w:nsid w:val="7A501932"/>
     <w:multiLevelType w:val="multilevel"/>
     <w:tmpl w:val="A7945BAA"/>
@@ -8013,7 +8908,156 @@
       </w:pPr>
     </w:lvl>
   </w:abstractNum>
-  <w:abstractNum w:abstractNumId="20" w15:restartNumberingAfterBreak="0">
+  <w:abstractNum w:abstractNumId="30" w15:restartNumberingAfterBreak="0">
+    <w:nsid w:val="7C18697A"/>
+    <w:multiLevelType w:val="multilevel"/>
+    <w:tmpl w:val="563E2134"/>
+    <w:lvl w:ilvl="0">
+      <w:start w:val="1"/>
+      <w:numFmt w:val="bullet"/>
+      <w:lvlText w:val=""/>
+      <w:lvlJc w:val="left"/>
+      <w:pPr>
+        <w:tabs>
+          <w:tab w:val="num" w:pos="720"/>
+        </w:tabs>
+        <w:ind w:left="720" w:hanging="360"/>
+      </w:pPr>
+      <w:rPr>
+        <w:rFonts w:ascii="Symbol" w:hAnsi="Symbol" w:hint="default"/>
+        <w:sz w:val="20"/>
+      </w:rPr>
+    </w:lvl>
+    <w:lvl w:ilvl="1" w:tentative="1">
+      <w:start w:val="1"/>
+      <w:numFmt w:val="bullet"/>
+      <w:lvlText w:val="o"/>
+      <w:lvlJc w:val="left"/>
+      <w:pPr>
+        <w:tabs>
+          <w:tab w:val="num" w:pos="1440"/>
+        </w:tabs>
+        <w:ind w:left="1440" w:hanging="360"/>
+      </w:pPr>
+      <w:rPr>
+        <w:rFonts w:ascii="Courier New" w:hAnsi="Courier New" w:hint="default"/>
+        <w:sz w:val="20"/>
+      </w:rPr>
+    </w:lvl>
+    <w:lvl w:ilvl="2" w:tentative="1">
+      <w:start w:val="1"/>
+      <w:numFmt w:val="bullet"/>
+      <w:lvlText w:val=""/>
+      <w:lvlJc w:val="left"/>
+      <w:pPr>
+        <w:tabs>
+          <w:tab w:val="num" w:pos="2160"/>
+        </w:tabs>
+        <w:ind w:left="2160" w:hanging="360"/>
+      </w:pPr>
+      <w:rPr>
+        <w:rFonts w:ascii="Wingdings" w:hAnsi="Wingdings" w:hint="default"/>
+        <w:sz w:val="20"/>
+      </w:rPr>
+    </w:lvl>
+    <w:lvl w:ilvl="3" w:tentative="1">
+      <w:start w:val="1"/>
+      <w:numFmt w:val="bullet"/>
+      <w:lvlText w:val=""/>
+      <w:lvlJc w:val="left"/>
+      <w:pPr>
+        <w:tabs>
+          <w:tab w:val="num" w:pos="2880"/>
+        </w:tabs>
+        <w:ind w:left="2880" w:hanging="360"/>
+      </w:pPr>
+      <w:rPr>
+        <w:rFonts w:ascii="Wingdings" w:hAnsi="Wingdings" w:hint="default"/>
+        <w:sz w:val="20"/>
+      </w:rPr>
+    </w:lvl>
+    <w:lvl w:ilvl="4" w:tentative="1">
+      <w:start w:val="1"/>
+      <w:numFmt w:val="bullet"/>
+      <w:lvlText w:val=""/>
+      <w:lvlJc w:val="left"/>
+      <w:pPr>
+        <w:tabs>
+          <w:tab w:val="num" w:pos="3600"/>
+        </w:tabs>
+        <w:ind w:left="3600" w:hanging="360"/>
+      </w:pPr>
+      <w:rPr>
+        <w:rFonts w:ascii="Wingdings" w:hAnsi="Wingdings" w:hint="default"/>
+        <w:sz w:val="20"/>
+      </w:rPr>
+    </w:lvl>
+    <w:lvl w:ilvl="5" w:tentative="1">
+      <w:start w:val="1"/>
+      <w:numFmt w:val="bullet"/>
+      <w:lvlText w:val=""/>
+      <w:lvlJc w:val="left"/>
+      <w:pPr>
+        <w:tabs>
+          <w:tab w:val="num" w:pos="4320"/>
+        </w:tabs>
+        <w:ind w:left="4320" w:hanging="360"/>
+      </w:pPr>
+      <w:rPr>
+        <w:rFonts w:ascii="Wingdings" w:hAnsi="Wingdings" w:hint="default"/>
+        <w:sz w:val="20"/>
+      </w:rPr>
+    </w:lvl>
+    <w:lvl w:ilvl="6" w:tentative="1">
+      <w:start w:val="1"/>
+      <w:numFmt w:val="bullet"/>
+      <w:lvlText w:val=""/>
+      <w:lvlJc w:val="left"/>
+      <w:pPr>
+        <w:tabs>
+          <w:tab w:val="num" w:pos="5040"/>
+        </w:tabs>
+        <w:ind w:left="5040" w:hanging="360"/>
+      </w:pPr>
+      <w:rPr>
+        <w:rFonts w:ascii="Wingdings" w:hAnsi="Wingdings" w:hint="default"/>
+        <w:sz w:val="20"/>
+      </w:rPr>
+    </w:lvl>
+    <w:lvl w:ilvl="7" w:tentative="1">
+      <w:start w:val="1"/>
+      <w:numFmt w:val="bullet"/>
+      <w:lvlText w:val=""/>
+      <w:lvlJc w:val="left"/>
+      <w:pPr>
+        <w:tabs>
+          <w:tab w:val="num" w:pos="5760"/>
+        </w:tabs>
+        <w:ind w:left="5760" w:hanging="360"/>
+      </w:pPr>
+      <w:rPr>
+        <w:rFonts w:ascii="Wingdings" w:hAnsi="Wingdings" w:hint="default"/>
+        <w:sz w:val="20"/>
+      </w:rPr>
+    </w:lvl>
+    <w:lvl w:ilvl="8" w:tentative="1">
+      <w:start w:val="1"/>
+      <w:numFmt w:val="bullet"/>
+      <w:lvlText w:val=""/>
+      <w:lvlJc w:val="left"/>
+      <w:pPr>
+        <w:tabs>
+          <w:tab w:val="num" w:pos="6480"/>
+        </w:tabs>
+        <w:ind w:left="6480" w:hanging="360"/>
+      </w:pPr>
+      <w:rPr>
+        <w:rFonts w:ascii="Wingdings" w:hAnsi="Wingdings" w:hint="default"/>
+        <w:sz w:val="20"/>
+      </w:rPr>
+    </w:lvl>
+  </w:abstractNum>
+  <w:abstractNum w:abstractNumId="31" w15:restartNumberingAfterBreak="0">
     <w:nsid w:val="7C7E4017"/>
     <w:multiLevelType w:val="multilevel"/>
     <w:tmpl w:val="0832C436"/>
@@ -8163,67 +9207,100 @@
     </w:lvl>
   </w:abstractNum>
   <w:num w:numId="1">
-    <w:abstractNumId w:val="3"/>
+    <w:abstractNumId w:val="4"/>
   </w:num>
   <w:num w:numId="2">
-    <w:abstractNumId w:val="9"/>
+    <w:abstractNumId w:val="16"/>
   </w:num>
   <w:num w:numId="3">
-    <w:abstractNumId w:val="15"/>
+    <w:abstractNumId w:val="23"/>
   </w:num>
   <w:num w:numId="4">
-    <w:abstractNumId w:val="5"/>
+    <w:abstractNumId w:val="7"/>
   </w:num>
   <w:num w:numId="5">
-    <w:abstractNumId w:val="8"/>
+    <w:abstractNumId w:val="13"/>
   </w:num>
   <w:num w:numId="6">
     <w:abstractNumId w:val="2"/>
   </w:num>
   <w:num w:numId="7">
-    <w:abstractNumId w:val="20"/>
+    <w:abstractNumId w:val="31"/>
   </w:num>
   <w:num w:numId="8">
-    <w:abstractNumId w:val="17"/>
+    <w:abstractNumId w:val="26"/>
   </w:num>
   <w:num w:numId="9">
-    <w:abstractNumId w:val="11"/>
+    <w:abstractNumId w:val="18"/>
   </w:num>
   <w:num w:numId="10">
-    <w:abstractNumId w:val="4"/>
+    <w:abstractNumId w:val="6"/>
   </w:num>
   <w:num w:numId="11">
-    <w:abstractNumId w:val="14"/>
+    <w:abstractNumId w:val="22"/>
   </w:num>
   <w:num w:numId="12">
     <w:abstractNumId w:val="0"/>
   </w:num>
   <w:num w:numId="13">
-    <w:abstractNumId w:val="12"/>
+    <w:abstractNumId w:val="19"/>
   </w:num>
   <w:num w:numId="14">
     <w:abstractNumId w:val="1"/>
   </w:num>
   <w:num w:numId="15">
-    <w:abstractNumId w:val="6"/>
+    <w:abstractNumId w:val="8"/>
   </w:num>
   <w:num w:numId="16">
+    <w:abstractNumId w:val="17"/>
+  </w:num>
+  <w:num w:numId="17">
+    <w:abstractNumId w:val="29"/>
+  </w:num>
+  <w:num w:numId="18">
+    <w:abstractNumId w:val="27"/>
+  </w:num>
+  <w:num w:numId="19">
+    <w:abstractNumId w:val="9"/>
+  </w:num>
+  <w:num w:numId="20">
+    <w:abstractNumId w:val="24"/>
+  </w:num>
+  <w:num w:numId="21">
+    <w:abstractNumId w:val="21"/>
+  </w:num>
+  <w:num w:numId="22">
+    <w:abstractNumId w:val="25"/>
+  </w:num>
+  <w:num w:numId="23">
+    <w:abstractNumId w:val="11"/>
+  </w:num>
+  <w:num w:numId="24">
+    <w:abstractNumId w:val="20"/>
+  </w:num>
+  <w:num w:numId="25">
+    <w:abstractNumId w:val="3"/>
+  </w:num>
+  <w:num w:numId="26">
+    <w:abstractNumId w:val="5"/>
+  </w:num>
+  <w:num w:numId="27">
+    <w:abstractNumId w:val="15"/>
+  </w:num>
+  <w:num w:numId="28">
     <w:abstractNumId w:val="10"/>
   </w:num>
-  <w:num w:numId="17">
-    <w:abstractNumId w:val="19"/>
+  <w:num w:numId="29">
+    <w:abstractNumId w:val="12"/>
   </w:num>
-  <w:num w:numId="18">
-    <w:abstractNumId w:val="18"/>
+  <w:num w:numId="30">
+    <w:abstractNumId w:val="30"/>
   </w:num>
-  <w:num w:numId="19">
-    <w:abstractNumId w:val="7"/>
+  <w:num w:numId="31">
+    <w:abstractNumId w:val="14"/>
   </w:num>
-  <w:num w:numId="20">
-    <w:abstractNumId w:val="16"/>
-  </w:num>
-  <w:num w:numId="21">
-    <w:abstractNumId w:val="13"/>
+  <w:num w:numId="32">
+    <w:abstractNumId w:val="28"/>
   </w:num>
 </w:numbering>
 </file>
@@ -8652,7 +9729,6 @@
     <w:next w:val="Normal"/>
     <w:link w:val="Heading3Char"/>
     <w:uiPriority w:val="9"/>
-    <w:semiHidden/>
     <w:unhideWhenUsed/>
     <w:qFormat/>
     <w:rsid w:val="005D4614"/>
@@ -8826,7 +9902,6 @@
     <w:basedOn w:val="DefaultParagraphFont"/>
     <w:link w:val="Heading3"/>
     <w:uiPriority w:val="9"/>
-    <w:semiHidden/>
     <w:rsid w:val="005D4614"/>
     <w:rPr>
       <w:rFonts w:asciiTheme="majorHAnsi" w:eastAsiaTheme="majorEastAsia" w:hAnsiTheme="majorHAnsi" w:cstheme="majorBidi"/>
@@ -8834,6 +9909,11 @@
       <w:sz w:val="24"/>
       <w:szCs w:val="24"/>
     </w:rPr>
+  </w:style>
+  <w:style w:type="character" w:customStyle="1" w:styleId="hljs-comment">
+    <w:name w:val="hljs-comment"/>
+    <w:basedOn w:val="DefaultParagraphFont"/>
+    <w:rsid w:val="00590E3D"/>
   </w:style>
 </w:styles>
 </file>

</xml_diff>